<commit_message>
Revise integrated financial risk research report
</commit_message>
<xml_diff>
--- a/reports/publication/Corporate_Financial_Deterioration_Combined_Phase1_Phase2_Research_Report.docx
+++ b/reports/publication/Corporate_Financial_Deterioration_Combined_Phase1_Phase2_Research_Report.docx
@@ -51,22 +51,7 @@
           <w:color w:val="2E75B6"/>
           <w:sz w:val="28"/>
         </w:rPr>
-        <w:t>Integrated Phase 1 and Phase 2 research report</w:t>
-      </w:r>
-    </w:p>
-    <w:p>
-      <w:pPr>
-        <w:jc w:val="center"/>
-      </w:pPr>
-      <w:r>
-        <w:rPr>
-          <w:rFonts w:ascii="Calibri" w:hAnsi="Calibri"/>
-          <w:b w:val="0"/>
-          <w:i w:val="0"/>
-          <w:color w:val="667085"/>
-          <w:sz w:val="20"/>
-        </w:rPr>
-        <w:t>SEC EDGAR + FRED | 117 active issuers | Financial cutoff 31 Dec 2025</w:t>
+        <w:t>Integrated Financial Risk Research Analysis: Phase 1 and Phase 2</w:t>
       </w:r>
     </w:p>
     <w:p>
@@ -1208,7 +1193,7 @@
           <w:color w:val="202124"/>
           <w:sz w:val="21"/>
         </w:rPr>
-        <w:t>Sector classification begins with the issuer's SEC Standard Industrial Classification code and a documented SIC-to-sector mapping. The mapping is then reviewed against the company's business description and dominant revenue activity. Classification follows the economic source of sales and cash flows—not a superficial label such as store format. Grocery-dominant discount retailers are therefore treated as Consumer Staples rather than Consumer Discretionary because essential food and household products dominate their economic exposure.</w:t>
+        <w:t>Sector classification begins with the issuer's SEC Standard Industrial Classification code and a documented SIC-to-sector mapping. The mapping is then reviewed against the company's business description and dominant revenue activity. Classification follows the economic source of sales and cash flows—not a superficial label such as store format.</w:t>
       </w:r>
     </w:p>
     <w:tbl>
@@ -2717,7 +2702,7 @@
           <w:color w:val="202124"/>
           <w:sz w:val="21"/>
         </w:rPr>
-        <w:t>Out-of-fold (OOF) means that a prediction was generated by a model that did not train on that observation. Expanding-window validation trains on the past and validates on a later period, then expands the training window. This creates unseen periods without violating temporal order, which ordinary random k-fold cross-validation would do.</w:t>
+        <w:t>Expanding-window validation trains on the available past and validates the model on a later period before expanding the training window. As a result, every validation prediction is out-of-fold (OOF): it is generated by a model that did not train on that observation. This creates genuinely unseen evaluation periods without violating temporal order, which ordinary random k-fold cross-validation would do.</w:t>
       </w:r>
     </w:p>
     <w:p>
@@ -4155,7 +4140,7 @@
                 <w:color w:val="202124"/>
                 <w:sz w:val="17"/>
               </w:rPr>
-              <w:t>Reason codes, uncertainty flags, TP/FP/FN reviews, and analyst prompts</w:t>
+              <w:t>Plain-language alert explanations, uncertainty indicators, reviews of correct alerts, false alerts, and missed deteriorations, plus prompts for analyst follow-up</w:t>
             </w:r>
           </w:p>
         </w:tc>
@@ -4165,21 +4150,6 @@
       <w:pPr>
         <w:spacing w:after="0"/>
       </w:pPr>
-    </w:p>
-    <w:p>
-      <w:pPr>
-        <w:spacing w:after="120" w:line="264" w:lineRule="auto"/>
-      </w:pPr>
-      <w:r>
-        <w:rPr>
-          <w:rFonts w:ascii="Calibri" w:hAnsi="Calibri"/>
-          <w:b w:val="0"/>
-          <w:i w:val="0"/>
-          <w:color w:val="202124"/>
-          <w:sz w:val="21"/>
-        </w:rPr>
-        <w:t>Partially pooled means the model estimates a shared relationship for both sectors while allowing a small number of Utility-specific differences. It is a middle ground between one pooled model that assumes identical relationships and separate sector models that may be unstable with only 42 Utility issuers.</w:t>
-      </w:r>
     </w:p>
     <w:p>
       <w:pPr>
@@ -4256,6 +4226,36 @@
           <w:sz w:val="32"/>
         </w:rPr>
         <w:t>10. Model comparison and interpretability trade-off</w:t>
+      </w:r>
+    </w:p>
+    <w:p>
+      <w:pPr>
+        <w:spacing w:after="120" w:line="264" w:lineRule="auto"/>
+      </w:pPr>
+      <w:r>
+        <w:rPr>
+          <w:rFonts w:ascii="Calibri" w:hAnsi="Calibri"/>
+          <w:b w:val="0"/>
+          <w:i w:val="0"/>
+          <w:color w:val="202124"/>
+          <w:sz w:val="21"/>
+        </w:rPr>
+        <w:t>Phase 2 compares three model architectures under the same temporal folds to determine how much sector flexibility and nonlinear modeling contribute. The pooled logistic benchmark estimates one common set of financial relationships. The partially pooled logistic model retains those shared relationships while allowing a small number of prespecified Utility-specific differences. This provides sector flexibility without fitting a fully separate Utility model from only 42 issuers, which could produce unstable estimates. Constrained boosting then tests whether nonlinear thresholds and interactions add ranking value beyond the logistic specifications.</w:t>
+      </w:r>
+    </w:p>
+    <w:p>
+      <w:pPr>
+        <w:spacing w:after="120" w:line="264" w:lineRule="auto"/>
+      </w:pPr>
+      <w:r>
+        <w:rPr>
+          <w:rFonts w:ascii="Calibri" w:hAnsi="Calibri"/>
+          <w:b w:val="0"/>
+          <w:i w:val="0"/>
+          <w:color w:val="202124"/>
+          <w:sz w:val="21"/>
+        </w:rPr>
+        <w:t>Precision and recall depend on where the alert threshold is placed, so the architectures require a common decision point for a fair comparison. The table uses a fixed 20% alert rate: for each model, the highest-risk one-fifth of out-of-fold company-quarter predictions are classified as alerts. Twenty percent was preregistered as a bounded analyst-capacity scenario alongside narrower 5% and 10% queues; it provides a broader reference queue without allowing workload to vary by model. It was not selected to maximize performance and is not the final operating policy. Section 11 instead chooses sector-specific thresholds that satisfy the project's 80% recall requirement.</w:t>
       </w:r>
     </w:p>
     <w:tbl>
@@ -4387,7 +4387,7 @@
                 <w:color w:val="17365D"/>
                 <w:sz w:val="18"/>
               </w:rPr>
-              <w:t>Recall*</w:t>
+              <w:t>Recall</w:t>
             </w:r>
           </w:p>
         </w:tc>
@@ -4415,7 +4415,7 @@
                 <w:color w:val="17365D"/>
                 <w:sz w:val="18"/>
               </w:rPr>
-              <w:t>Precision*</w:t>
+              <w:t>Precision</w:t>
             </w:r>
           </w:p>
         </w:tc>
@@ -4958,78 +4958,7 @@
           <w:color w:val="202124"/>
           <w:sz w:val="21"/>
         </w:rPr>
-        <w:t>*Recall and precision in this comparison use a common 20% alert-rate reference, so ranking and probability quality are compared under the same workload. The operational policy below uses different thresholds to satisfy the recall-first goal.</w:t>
-      </w:r>
-    </w:p>
-    <w:p>
-      <w:pPr>
-        <w:spacing w:after="120" w:line="264" w:lineRule="auto"/>
-      </w:pPr>
-      <w:r>
-        <w:rPr>
-          <w:rFonts w:ascii="Calibri" w:hAnsi="Calibri"/>
-          <w:b w:val="0"/>
-          <w:i w:val="0"/>
-          <w:color w:val="202124"/>
-          <w:sz w:val="21"/>
-        </w:rPr>
-        <w:t>Testing all three architectures was necessary to answer separate questions. The pooled logistic model tests whether sector deviations add value. The partially pooled model tests the planned hierarchical idea in an interpretable form. Boosting tests whether important nonlinear thresholds and interactions are being missed. The boosting challenger ranked better, but the partially pooled logistic model remains the registered primary because the project prioritizes explainability and defensible financial relationships. The challenger should remain visible rather than being discarded.</w:t>
-      </w:r>
-    </w:p>
-    <w:p>
-      <w:pPr>
-        <w:keepNext/>
-        <w:jc w:val="center"/>
-      </w:pPr>
-      <w:r>
-        <w:drawing>
-          <wp:inline xmlns:a="http://schemas.openxmlformats.org/drawingml/2006/main" xmlns:pic="http://schemas.openxmlformats.org/drawingml/2006/picture">
-            <wp:extent cx="5715000" cy="2541781"/>
-            <wp:docPr id="1" name="Picture 1" descr="Figure 1. Performance estimates are shown together for orientation, but the evidence sets are not directly interchangeable."/>
-            <wp:cNvGraphicFramePr>
-              <a:graphicFrameLocks noChangeAspect="1"/>
-            </wp:cNvGraphicFramePr>
-            <a:graphic>
-              <a:graphicData uri="http://schemas.openxmlformats.org/drawingml/2006/picture">
-                <pic:pic>
-                  <pic:nvPicPr>
-                    <pic:cNvPr id="0" name="performance_evidence.png"/>
-                    <pic:cNvPicPr/>
-                  </pic:nvPicPr>
-                  <pic:blipFill>
-                    <a:blip r:embed="rId11"/>
-                    <a:stretch>
-                      <a:fillRect/>
-                    </a:stretch>
-                  </pic:blipFill>
-                  <pic:spPr>
-                    <a:xfrm>
-                      <a:off x="0" y="0"/>
-                      <a:ext cx="5715000" cy="2541781"/>
-                    </a:xfrm>
-                    <a:prstGeom prst="rect"/>
-                  </pic:spPr>
-                </pic:pic>
-              </a:graphicData>
-            </a:graphic>
-          </wp:inline>
-        </w:drawing>
-      </w:r>
-    </w:p>
-    <w:p>
-      <w:pPr>
-        <w:spacing w:after="160"/>
-        <w:jc w:val="center"/>
-      </w:pPr>
-      <w:r>
-        <w:rPr>
-          <w:rFonts w:ascii="Calibri" w:hAnsi="Calibri"/>
-          <w:b w:val="0"/>
-          <w:i/>
-          <w:color w:val="667085"/>
-          <w:sz w:val="17"/>
-        </w:rPr>
-        <w:t>Figure 1. Performance estimates are shown together for orientation, but the evidence sets are not directly interchangeable.</w:t>
+        <w:t>Partial pooling increased development PR-AUC from 0.367 to 0.379 relative to the pooled benchmark, providing modest evidence that limited sector differences add value. Constrained boosting ranked events best at 0.412 PR-AUC and also produced the lowest Brier score. The partially pooled logistic model nevertheless remains the registered primary because its financial relationships and sector adjustments are easier to explain and audit. The boosting result is retained as transparent evidence of the performance sacrificed for interpretability.</w:t>
       </w:r>
     </w:p>
     <w:p>
@@ -5896,7 +5825,7 @@
         <w:drawing>
           <wp:inline xmlns:a="http://schemas.openxmlformats.org/drawingml/2006/main" xmlns:pic="http://schemas.openxmlformats.org/drawingml/2006/picture">
             <wp:extent cx="5715000" cy="2578720"/>
-            <wp:docPr id="2" name="Picture 2" descr="Figure 2. The two-quarter label reduces queue size but loses ranking quality, precision, and warning time."/>
+            <wp:docPr id="1" name="Picture 1" descr="Figure 1. The two-quarter label reduces queue size but loses ranking quality, precision, and warning time."/>
             <wp:cNvGraphicFramePr>
               <a:graphicFrameLocks noChangeAspect="1"/>
             </wp:cNvGraphicFramePr>
@@ -5908,7 +5837,7 @@
                     <pic:cNvPicPr/>
                   </pic:nvPicPr>
                   <pic:blipFill>
-                    <a:blip r:embed="rId12"/>
+                    <a:blip r:embed="rId11"/>
                     <a:stretch>
                       <a:fillRect/>
                     </a:stretch>
@@ -5940,7 +5869,7 @@
           <w:color w:val="667085"/>
           <w:sz w:val="17"/>
         </w:rPr>
-        <w:t>Figure 2. The two-quarter label reduces queue size but loses ranking quality, precision, and warning time.</w:t>
+        <w:t>Figure 1. The two-quarter label reduces queue size but loses ranking quality, precision, and warning time.</w:t>
       </w:r>
     </w:p>
     <w:p>
@@ -5972,6 +5901,31 @@
           <w:sz w:val="32"/>
         </w:rPr>
         <w:t>13. Company-level case studies</w:t>
+      </w:r>
+    </w:p>
+    <w:p>
+      <w:pPr>
+        <w:spacing w:after="120" w:line="264" w:lineRule="auto"/>
+      </w:pPr>
+      <w:r>
+        <w:rPr>
+          <w:rFonts w:ascii="Calibri" w:hAnsi="Calibri"/>
+          <w:b/>
+          <w:i w:val="0"/>
+          <w:color w:val="17365D"/>
+          <w:sz w:val="21"/>
+        </w:rPr>
+        <w:t xml:space="preserve">How the cases are classified. </w:t>
+      </w:r>
+      <w:r>
+        <w:rPr>
+          <w:rFonts w:ascii="Calibri" w:hAnsi="Calibri"/>
+          <w:b w:val="0"/>
+          <w:i w:val="0"/>
+          <w:color w:val="202124"/>
+          <w:sz w:val="21"/>
+        </w:rPr>
+        <w:t>The outcome is prospective: a company experiences financial deterioration when, within the four fiscal quarters after the decision date, its interest coverage falls below 1.5x and declines by at least 40% from its decision-date level. This realized-outcome rule is separate from the model's sector-specific probability threshold, which determines whether the company enters the analyst review queue before the future outcome is known. A true positive is alerted and later meets the deterioration rule; a false positive is alerted but does not meet both outcome conditions; and a missed deterioration is not alerted but later meets the rule. The ratios below describe only the information available when each prediction was made.</w:t>
       </w:r>
     </w:p>
     <w:p>
@@ -6012,12 +5966,22 @@
       <w:r>
         <w:rPr>
           <w:rFonts w:ascii="Calibri" w:hAnsi="Calibri"/>
+          <w:b/>
+          <w:i w:val="0"/>
+          <w:color w:val="17365D"/>
+          <w:sz w:val="21"/>
+        </w:rPr>
+        <w:t xml:space="preserve">Why it is a true positive. </w:t>
+      </w:r>
+      <w:r>
+        <w:rPr>
+          <w:rFonts w:ascii="Calibri" w:hAnsi="Calibri"/>
           <w:b w:val="0"/>
           <w:i w:val="0"/>
           <w:color w:val="202124"/>
           <w:sz w:val="21"/>
         </w:rPr>
-        <w:t>Not an error; the available financial signals ranked this event above its sector threshold.</w:t>
+        <w:t>The probability exceeded the sector threshold, so the model issued an alert. Coverage subsequently fell from 6.01x to 0.93x 3 quarters later—a 84.6% decline that crossed below 1.5x and exceeded the 40% decline requirement.</w:t>
       </w:r>
     </w:p>
     <w:p>
@@ -6058,12 +6022,22 @@
       <w:r>
         <w:rPr>
           <w:rFonts w:ascii="Calibri" w:hAnsi="Calibri"/>
+          <w:b/>
+          <w:i w:val="0"/>
+          <w:color w:val="17365D"/>
+          <w:sz w:val="21"/>
+        </w:rPr>
+        <w:t xml:space="preserve">Why it is a false positive. </w:t>
+      </w:r>
+      <w:r>
+        <w:rPr>
+          <w:rFonts w:ascii="Calibri" w:hAnsi="Calibri"/>
           <w:b w:val="0"/>
           <w:i w:val="0"/>
           <w:color w:val="202124"/>
           <w:sz w:val="21"/>
         </w:rPr>
-        <w:t>Weak contemporaneous signals resembled deterioration, but future coverage did not satisfy both the level and decline rules.</w:t>
+        <w:t>The probability exceeded the sector threshold, so the model issued an alert. However, coverage was already -7.49x at the decision date and its four-quarter minimum was -3.67x. Because coverage became less negative rather than declining another 40%, the future outcome did not satisfy both parts of the deterioration rule.</w:t>
       </w:r>
     </w:p>
     <w:p>
@@ -6104,18 +6078,13 @@
       <w:r>
         <w:rPr>
           <w:rFonts w:ascii="Calibri" w:hAnsi="Calibri"/>
-          <w:b w:val="0"/>
+          <w:b/>
           <w:i w:val="0"/>
-          <w:color w:val="202124"/>
+          <w:color w:val="17365D"/>
           <w:sz w:val="21"/>
         </w:rPr>
-        <w:t>The observed predictors produced a score just below the sector cutoff; the later coverage decline was not strong enough in the available signals to trigger review.</w:t>
+        <w:t xml:space="preserve">Why it is a missed deterioration. </w:t>
       </w:r>
-    </w:p>
-    <w:p>
-      <w:pPr>
-        <w:spacing w:after="120" w:line="264" w:lineRule="auto"/>
-      </w:pPr>
       <w:r>
         <w:rPr>
           <w:rFonts w:ascii="Calibri" w:hAnsi="Calibri"/>
@@ -6124,7 +6093,7 @@
           <w:color w:val="202124"/>
           <w:sz w:val="21"/>
         </w:rPr>
-        <w:t>The three cases show why the model should support—not replace—analysis. Designer Brands demonstrates early signal value. Under Armour shows how severe current weakness can trigger a reasonable precautionary review without satisfying the exact future transition rule. NRG shows that a later deterioration may be missed when contemporaneous ratios do not yet reveal the change.</w:t>
+        <w:t>The 12.1% probability was narrowly below the 12.3% Utility threshold, so the model did not issue an alert. Coverage subsequently fell from 6.89x to -1.48x within 1 quarter—a 121.5% decline that crossed below 1.5x and met the realized-outcome rule.</w:t>
       </w:r>
     </w:p>
     <w:p>
@@ -6986,7 +6955,24 @@
           <w:color w:val="202124"/>
           <w:sz w:val="20"/>
         </w:rPr>
-        <w:t>Survivorship bias: active-company-only sampling excludes delisted and failed issuers, so this is not a default-population study.</w:t>
+        <w:t>Potential value of failed-company histories: Adding point-in-time eligible delisted and failed issuers could expose the model to more severe deterioration paths, increase the diversity of observed events, and test whether the financial signals generalize beyond companies that remain active today.</w:t>
+      </w:r>
+    </w:p>
+    <w:p>
+      <w:pPr>
+        <w:pStyle w:val="ListBullet"/>
+        <w:spacing w:after="100" w:line="280" w:lineRule="auto"/>
+        <w:ind w:left="720" w:hanging="360"/>
+      </w:pPr>
+      <w:r>
+        <w:rPr>
+          <w:rFonts w:ascii="Calibri" w:hAnsi="Calibri"/>
+          <w:b w:val="0"/>
+          <w:i w:val="0"/>
+          <w:color w:val="202124"/>
+          <w:sz w:val="20"/>
+        </w:rPr>
+        <w:t>Limitations of expanding the population: A valid extension would need to reconstruct historical company universes without selecting firms because they later failed, resolve incomplete filings and identifier changes, and distinguish interest-coverage deterioration from bankruptcy, mergers, acquisitions, and other reasons for delisting. Adding these companies without those controls could introduce look-ahead or selection bias and unintentionally change the outcome being modeled.</w:t>
       </w:r>
     </w:p>
     <w:p>
@@ -7110,21 +7096,6 @@
     </w:p>
     <w:p>
       <w:pPr>
-        <w:spacing w:after="120" w:line="264" w:lineRule="auto"/>
-      </w:pPr>
-      <w:r>
-        <w:rPr>
-          <w:rFonts w:ascii="Calibri" w:hAnsi="Calibri"/>
-          <w:b w:val="0"/>
-          <w:i w:val="0"/>
-          <w:color w:val="202124"/>
-          <w:sz w:val="21"/>
-        </w:rPr>
-        <w:t>Governance requires versioned configurations, deterministic seeds, source lineage, audit tables, model/data cards, automated leakage tests, frozen thresholds, monitoring for population and calibration drift, and clear statements of evidence level. Credentials remain in the ignored environment file; no secret keys or raw proprietary data belong in published artifacts.</w:t>
-      </w:r>
-    </w:p>
-    <w:p>
-      <w:pPr>
         <w:pStyle w:val="Heading1"/>
         <w:keepNext/>
       </w:pPr>
@@ -7136,7 +7107,7 @@
           <w:color w:val="17365D"/>
           <w:sz w:val="32"/>
         </w:rPr>
-        <w:t>16. Prospective test plan</w:t>
+        <w:t>16. Bridge backtest and prospective test plan</w:t>
       </w:r>
     </w:p>
     <w:p>
@@ -7151,7 +7122,630 @@
           <w:color w:val="202124"/>
           <w:sz w:val="21"/>
         </w:rPr>
-        <w:t>The next decisive step is not further tuning on the existing outcomes. The current two-sector Phase 2 specification, feature rules, calibration procedure, and sector thresholds should be frozen. Company quarters after the 31 December 2025 financial cutoff should remain unexamined until their complete four-quarter outcomes are available.</w:t>
+        <w:t>Before the final post-2025 prospective test matures, the project will conduct a pseudo-prospective backtest. Models will be trained using financial information available through 31 December 2023, predictions will be generated from information available at decision dates during 2024, and those predictions will be evaluated against four-quarter outcomes extending through 2025. This preserves the order in which information became available and provides a recent backtest. However, because the 2024–2025 period has already been observed during the broader project, the result will be treated as retrospective development evidence rather than a new untouched holdout.</w:t>
+      </w:r>
+    </w:p>
+    <w:p>
+      <w:pPr>
+        <w:spacing w:after="120" w:line="264" w:lineRule="auto"/>
+      </w:pPr>
+      <w:r>
+        <w:rPr>
+          <w:rFonts w:ascii="Calibri" w:hAnsi="Calibri"/>
+          <w:b w:val="0"/>
+          <w:i w:val="0"/>
+          <w:color w:val="202124"/>
+          <w:sz w:val="21"/>
+        </w:rPr>
+        <w:t>The project will also apply the Phase 1 methodology to the expanded 117-company population as part of a controlled Phase 1–Phase 2 bridge analysis. Four specifications will be evaluated using the same four-quarter deterioration label, temporal folds, eligible company-quarter observations, and performance measures:</w:t>
+      </w:r>
+    </w:p>
+    <w:tbl>
+      <w:tblPr>
+        <w:tblStyle w:val="TableGrid"/>
+        <w:tblW w:type="dxa" w:w="9360"/>
+        <w:jc w:val="left"/>
+        <w:tblLayout w:type="fixed"/>
+        <w:tblLook w:firstColumn="1" w:firstRow="1" w:lastColumn="0" w:lastRow="0" w:noHBand="0" w:noVBand="1" w:val="04A0"/>
+        <w:tblInd w:w="120" w:type="dxa"/>
+      </w:tblPr>
+      <w:tblGrid>
+        <w:gridCol w:w="1100"/>
+        <w:gridCol w:w="2000"/>
+        <w:gridCol w:w="1600"/>
+        <w:gridCol w:w="4660"/>
+      </w:tblGrid>
+      <w:tr>
+        <w:trPr>
+          <w:tblHeader/>
+        </w:trPr>
+        <w:tc>
+          <w:tcPr>
+            <w:tcW w:type="dxa" w:w="1100"/>
+            <w:shd w:fill="EAF1F8"/>
+            <w:vAlign w:val="center"/>
+            <w:tcMar>
+              <w:top w:w="80" w:type="dxa"/>
+              <w:bottom w:w="80" w:type="dxa"/>
+              <w:start w:w="120" w:type="dxa"/>
+              <w:end w:w="120" w:type="dxa"/>
+            </w:tcMar>
+          </w:tcPr>
+          <w:p>
+            <w:pPr>
+              <w:spacing w:after="0"/>
+            </w:pPr>
+            <w:r>
+              <w:rPr>
+                <w:rFonts w:ascii="Calibri" w:hAnsi="Calibri"/>
+                <w:b/>
+                <w:i w:val="0"/>
+                <w:color w:val="17365D"/>
+                <w:sz w:val="18"/>
+              </w:rPr>
+              <w:t>Test</w:t>
+            </w:r>
+          </w:p>
+        </w:tc>
+        <w:tc>
+          <w:tcPr>
+            <w:tcW w:type="dxa" w:w="2000"/>
+            <w:shd w:fill="EAF1F8"/>
+            <w:vAlign w:val="center"/>
+            <w:tcMar>
+              <w:top w:w="80" w:type="dxa"/>
+              <w:bottom w:w="80" w:type="dxa"/>
+              <w:start w:w="120" w:type="dxa"/>
+              <w:end w:w="120" w:type="dxa"/>
+            </w:tcMar>
+          </w:tcPr>
+          <w:p>
+            <w:pPr>
+              <w:spacing w:after="0"/>
+            </w:pPr>
+            <w:r>
+              <w:rPr>
+                <w:rFonts w:ascii="Calibri" w:hAnsi="Calibri"/>
+                <w:b/>
+                <w:i w:val="0"/>
+                <w:color w:val="17365D"/>
+                <w:sz w:val="18"/>
+              </w:rPr>
+              <w:t>Population</w:t>
+            </w:r>
+          </w:p>
+        </w:tc>
+        <w:tc>
+          <w:tcPr>
+            <w:tcW w:type="dxa" w:w="1600"/>
+            <w:shd w:fill="EAF1F8"/>
+            <w:vAlign w:val="center"/>
+            <w:tcMar>
+              <w:top w:w="80" w:type="dxa"/>
+              <w:bottom w:w="80" w:type="dxa"/>
+              <w:start w:w="120" w:type="dxa"/>
+              <w:end w:w="120" w:type="dxa"/>
+            </w:tcMar>
+          </w:tcPr>
+          <w:p>
+            <w:pPr>
+              <w:spacing w:after="0"/>
+            </w:pPr>
+            <w:r>
+              <w:rPr>
+                <w:rFonts w:ascii="Calibri" w:hAnsi="Calibri"/>
+                <w:b/>
+                <w:i w:val="0"/>
+                <w:color w:val="17365D"/>
+                <w:sz w:val="18"/>
+              </w:rPr>
+              <w:t>Method</w:t>
+            </w:r>
+          </w:p>
+        </w:tc>
+        <w:tc>
+          <w:tcPr>
+            <w:tcW w:type="dxa" w:w="4660"/>
+            <w:shd w:fill="EAF1F8"/>
+            <w:vAlign w:val="center"/>
+            <w:tcMar>
+              <w:top w:w="80" w:type="dxa"/>
+              <w:bottom w:w="80" w:type="dxa"/>
+              <w:start w:w="120" w:type="dxa"/>
+              <w:end w:w="120" w:type="dxa"/>
+            </w:tcMar>
+          </w:tcPr>
+          <w:p>
+            <w:pPr>
+              <w:spacing w:after="0"/>
+            </w:pPr>
+            <w:r>
+              <w:rPr>
+                <w:rFonts w:ascii="Calibri" w:hAnsi="Calibri"/>
+                <w:b/>
+                <w:i w:val="0"/>
+                <w:color w:val="17365D"/>
+                <w:sz w:val="18"/>
+              </w:rPr>
+              <w:t>Purpose</w:t>
+            </w:r>
+          </w:p>
+        </w:tc>
+      </w:tr>
+      <w:tr>
+        <w:tc>
+          <w:tcPr>
+            <w:tcW w:type="dxa" w:w="1100"/>
+            <w:vAlign w:val="center"/>
+            <w:tcMar>
+              <w:top w:w="80" w:type="dxa"/>
+              <w:bottom w:w="80" w:type="dxa"/>
+              <w:start w:w="120" w:type="dxa"/>
+              <w:end w:w="120" w:type="dxa"/>
+            </w:tcMar>
+          </w:tcPr>
+          <w:p>
+            <w:pPr>
+              <w:spacing w:after="0"/>
+            </w:pPr>
+            <w:r>
+              <w:rPr>
+                <w:rFonts w:ascii="Calibri" w:hAnsi="Calibri"/>
+                <w:b w:val="0"/>
+                <w:i w:val="0"/>
+                <w:color w:val="202124"/>
+                <w:sz w:val="17"/>
+              </w:rPr>
+              <w:t>A</w:t>
+            </w:r>
+          </w:p>
+        </w:tc>
+        <w:tc>
+          <w:tcPr>
+            <w:tcW w:type="dxa" w:w="2000"/>
+            <w:vAlign w:val="center"/>
+            <w:tcMar>
+              <w:top w:w="80" w:type="dxa"/>
+              <w:bottom w:w="80" w:type="dxa"/>
+              <w:start w:w="120" w:type="dxa"/>
+              <w:end w:w="120" w:type="dxa"/>
+            </w:tcMar>
+          </w:tcPr>
+          <w:p>
+            <w:pPr>
+              <w:spacing w:after="0"/>
+            </w:pPr>
+            <w:r>
+              <w:rPr>
+                <w:rFonts w:ascii="Calibri" w:hAnsi="Calibri"/>
+                <w:b w:val="0"/>
+                <w:i w:val="0"/>
+                <w:color w:val="202124"/>
+                <w:sz w:val="17"/>
+              </w:rPr>
+              <w:t>Original 60 companies</w:t>
+            </w:r>
+          </w:p>
+        </w:tc>
+        <w:tc>
+          <w:tcPr>
+            <w:tcW w:type="dxa" w:w="1600"/>
+            <w:vAlign w:val="center"/>
+            <w:tcMar>
+              <w:top w:w="80" w:type="dxa"/>
+              <w:bottom w:w="80" w:type="dxa"/>
+              <w:start w:w="120" w:type="dxa"/>
+              <w:end w:w="120" w:type="dxa"/>
+            </w:tcMar>
+          </w:tcPr>
+          <w:p>
+            <w:pPr>
+              <w:spacing w:after="0"/>
+            </w:pPr>
+            <w:r>
+              <w:rPr>
+                <w:rFonts w:ascii="Calibri" w:hAnsi="Calibri"/>
+                <w:b w:val="0"/>
+                <w:i w:val="0"/>
+                <w:color w:val="202124"/>
+                <w:sz w:val="17"/>
+              </w:rPr>
+              <w:t>Phase 1</w:t>
+            </w:r>
+          </w:p>
+        </w:tc>
+        <w:tc>
+          <w:tcPr>
+            <w:tcW w:type="dxa" w:w="4660"/>
+            <w:vAlign w:val="center"/>
+            <w:tcMar>
+              <w:top w:w="80" w:type="dxa"/>
+              <w:bottom w:w="80" w:type="dxa"/>
+              <w:start w:w="120" w:type="dxa"/>
+              <w:end w:w="120" w:type="dxa"/>
+            </w:tcMar>
+          </w:tcPr>
+          <w:p>
+            <w:pPr>
+              <w:spacing w:after="0"/>
+            </w:pPr>
+            <w:r>
+              <w:rPr>
+                <w:rFonts w:ascii="Calibri" w:hAnsi="Calibri"/>
+                <w:b w:val="0"/>
+                <w:i w:val="0"/>
+                <w:color w:val="202124"/>
+                <w:sz w:val="17"/>
+              </w:rPr>
+              <w:t>Establish the common-period baseline.</w:t>
+            </w:r>
+          </w:p>
+        </w:tc>
+      </w:tr>
+      <w:tr>
+        <w:tc>
+          <w:tcPr>
+            <w:tcW w:type="dxa" w:w="1100"/>
+            <w:vAlign w:val="center"/>
+            <w:tcMar>
+              <w:top w:w="80" w:type="dxa"/>
+              <w:bottom w:w="80" w:type="dxa"/>
+              <w:start w:w="120" w:type="dxa"/>
+              <w:end w:w="120" w:type="dxa"/>
+            </w:tcMar>
+          </w:tcPr>
+          <w:p>
+            <w:pPr>
+              <w:spacing w:after="0"/>
+            </w:pPr>
+            <w:r>
+              <w:rPr>
+                <w:rFonts w:ascii="Calibri" w:hAnsi="Calibri"/>
+                <w:b w:val="0"/>
+                <w:i w:val="0"/>
+                <w:color w:val="202124"/>
+                <w:sz w:val="17"/>
+              </w:rPr>
+              <w:t>B</w:t>
+            </w:r>
+          </w:p>
+        </w:tc>
+        <w:tc>
+          <w:tcPr>
+            <w:tcW w:type="dxa" w:w="2000"/>
+            <w:vAlign w:val="center"/>
+            <w:tcMar>
+              <w:top w:w="80" w:type="dxa"/>
+              <w:bottom w:w="80" w:type="dxa"/>
+              <w:start w:w="120" w:type="dxa"/>
+              <w:end w:w="120" w:type="dxa"/>
+            </w:tcMar>
+          </w:tcPr>
+          <w:p>
+            <w:pPr>
+              <w:spacing w:after="0"/>
+            </w:pPr>
+            <w:r>
+              <w:rPr>
+                <w:rFonts w:ascii="Calibri" w:hAnsi="Calibri"/>
+                <w:b w:val="0"/>
+                <w:i w:val="0"/>
+                <w:color w:val="202124"/>
+                <w:sz w:val="17"/>
+              </w:rPr>
+              <w:t>Original 60 companies</w:t>
+            </w:r>
+          </w:p>
+        </w:tc>
+        <w:tc>
+          <w:tcPr>
+            <w:tcW w:type="dxa" w:w="1600"/>
+            <w:vAlign w:val="center"/>
+            <w:tcMar>
+              <w:top w:w="80" w:type="dxa"/>
+              <w:bottom w:w="80" w:type="dxa"/>
+              <w:start w:w="120" w:type="dxa"/>
+              <w:end w:w="120" w:type="dxa"/>
+            </w:tcMar>
+          </w:tcPr>
+          <w:p>
+            <w:pPr>
+              <w:spacing w:after="0"/>
+            </w:pPr>
+            <w:r>
+              <w:rPr>
+                <w:rFonts w:ascii="Calibri" w:hAnsi="Calibri"/>
+                <w:b w:val="0"/>
+                <w:i w:val="0"/>
+                <w:color w:val="202124"/>
+                <w:sz w:val="17"/>
+              </w:rPr>
+              <w:t>Phase 2</w:t>
+            </w:r>
+          </w:p>
+        </w:tc>
+        <w:tc>
+          <w:tcPr>
+            <w:tcW w:type="dxa" w:w="4660"/>
+            <w:vAlign w:val="center"/>
+            <w:tcMar>
+              <w:top w:w="80" w:type="dxa"/>
+              <w:bottom w:w="80" w:type="dxa"/>
+              <w:start w:w="120" w:type="dxa"/>
+              <w:end w:w="120" w:type="dxa"/>
+            </w:tcMar>
+          </w:tcPr>
+          <w:p>
+            <w:pPr>
+              <w:spacing w:after="0"/>
+            </w:pPr>
+            <w:r>
+              <w:rPr>
+                <w:rFonts w:ascii="Calibri" w:hAnsi="Calibri"/>
+                <w:b w:val="0"/>
+                <w:i w:val="0"/>
+                <w:color w:val="202124"/>
+                <w:sz w:val="17"/>
+              </w:rPr>
+              <w:t>Compare methodology with A while holding the population constant.</w:t>
+            </w:r>
+          </w:p>
+        </w:tc>
+      </w:tr>
+      <w:tr>
+        <w:tc>
+          <w:tcPr>
+            <w:tcW w:type="dxa" w:w="1100"/>
+            <w:vAlign w:val="center"/>
+            <w:tcMar>
+              <w:top w:w="80" w:type="dxa"/>
+              <w:bottom w:w="80" w:type="dxa"/>
+              <w:start w:w="120" w:type="dxa"/>
+              <w:end w:w="120" w:type="dxa"/>
+            </w:tcMar>
+          </w:tcPr>
+          <w:p>
+            <w:pPr>
+              <w:spacing w:after="0"/>
+            </w:pPr>
+            <w:r>
+              <w:rPr>
+                <w:rFonts w:ascii="Calibri" w:hAnsi="Calibri"/>
+                <w:b w:val="0"/>
+                <w:i w:val="0"/>
+                <w:color w:val="202124"/>
+                <w:sz w:val="17"/>
+              </w:rPr>
+              <w:t>C</w:t>
+            </w:r>
+          </w:p>
+        </w:tc>
+        <w:tc>
+          <w:tcPr>
+            <w:tcW w:type="dxa" w:w="2000"/>
+            <w:vAlign w:val="center"/>
+            <w:tcMar>
+              <w:top w:w="80" w:type="dxa"/>
+              <w:bottom w:w="80" w:type="dxa"/>
+              <w:start w:w="120" w:type="dxa"/>
+              <w:end w:w="120" w:type="dxa"/>
+            </w:tcMar>
+          </w:tcPr>
+          <w:p>
+            <w:pPr>
+              <w:spacing w:after="0"/>
+            </w:pPr>
+            <w:r>
+              <w:rPr>
+                <w:rFonts w:ascii="Calibri" w:hAnsi="Calibri"/>
+                <w:b w:val="0"/>
+                <w:i w:val="0"/>
+                <w:color w:val="202124"/>
+                <w:sz w:val="17"/>
+              </w:rPr>
+              <w:t>Expanded 117 companies</w:t>
+            </w:r>
+          </w:p>
+        </w:tc>
+        <w:tc>
+          <w:tcPr>
+            <w:tcW w:type="dxa" w:w="1600"/>
+            <w:vAlign w:val="center"/>
+            <w:tcMar>
+              <w:top w:w="80" w:type="dxa"/>
+              <w:bottom w:w="80" w:type="dxa"/>
+              <w:start w:w="120" w:type="dxa"/>
+              <w:end w:w="120" w:type="dxa"/>
+            </w:tcMar>
+          </w:tcPr>
+          <w:p>
+            <w:pPr>
+              <w:spacing w:after="0"/>
+            </w:pPr>
+            <w:r>
+              <w:rPr>
+                <w:rFonts w:ascii="Calibri" w:hAnsi="Calibri"/>
+                <w:b w:val="0"/>
+                <w:i w:val="0"/>
+                <w:color w:val="202124"/>
+                <w:sz w:val="17"/>
+              </w:rPr>
+              <w:t>Phase 1</w:t>
+            </w:r>
+          </w:p>
+        </w:tc>
+        <w:tc>
+          <w:tcPr>
+            <w:tcW w:type="dxa" w:w="4660"/>
+            <w:vAlign w:val="center"/>
+            <w:tcMar>
+              <w:top w:w="80" w:type="dxa"/>
+              <w:bottom w:w="80" w:type="dxa"/>
+              <w:start w:w="120" w:type="dxa"/>
+              <w:end w:w="120" w:type="dxa"/>
+            </w:tcMar>
+          </w:tcPr>
+          <w:p>
+            <w:pPr>
+              <w:spacing w:after="0"/>
+            </w:pPr>
+            <w:r>
+              <w:rPr>
+                <w:rFonts w:ascii="Calibri" w:hAnsi="Calibri"/>
+                <w:b w:val="0"/>
+                <w:i w:val="0"/>
+                <w:color w:val="202124"/>
+                <w:sz w:val="17"/>
+              </w:rPr>
+              <w:t>Measure population expansion under the Phase 1 methodology.</w:t>
+            </w:r>
+          </w:p>
+        </w:tc>
+      </w:tr>
+      <w:tr>
+        <w:tc>
+          <w:tcPr>
+            <w:tcW w:type="dxa" w:w="1100"/>
+            <w:vAlign w:val="center"/>
+            <w:tcMar>
+              <w:top w:w="80" w:type="dxa"/>
+              <w:bottom w:w="80" w:type="dxa"/>
+              <w:start w:w="120" w:type="dxa"/>
+              <w:end w:w="120" w:type="dxa"/>
+            </w:tcMar>
+          </w:tcPr>
+          <w:p>
+            <w:pPr>
+              <w:spacing w:after="0"/>
+            </w:pPr>
+            <w:r>
+              <w:rPr>
+                <w:rFonts w:ascii="Calibri" w:hAnsi="Calibri"/>
+                <w:b w:val="0"/>
+                <w:i w:val="0"/>
+                <w:color w:val="202124"/>
+                <w:sz w:val="17"/>
+              </w:rPr>
+              <w:t>D</w:t>
+            </w:r>
+          </w:p>
+        </w:tc>
+        <w:tc>
+          <w:tcPr>
+            <w:tcW w:type="dxa" w:w="2000"/>
+            <w:vAlign w:val="center"/>
+            <w:tcMar>
+              <w:top w:w="80" w:type="dxa"/>
+              <w:bottom w:w="80" w:type="dxa"/>
+              <w:start w:w="120" w:type="dxa"/>
+              <w:end w:w="120" w:type="dxa"/>
+            </w:tcMar>
+          </w:tcPr>
+          <w:p>
+            <w:pPr>
+              <w:spacing w:after="0"/>
+            </w:pPr>
+            <w:r>
+              <w:rPr>
+                <w:rFonts w:ascii="Calibri" w:hAnsi="Calibri"/>
+                <w:b w:val="0"/>
+                <w:i w:val="0"/>
+                <w:color w:val="202124"/>
+                <w:sz w:val="17"/>
+              </w:rPr>
+              <w:t>Expanded 117 companies</w:t>
+            </w:r>
+          </w:p>
+        </w:tc>
+        <w:tc>
+          <w:tcPr>
+            <w:tcW w:type="dxa" w:w="1600"/>
+            <w:vAlign w:val="center"/>
+            <w:tcMar>
+              <w:top w:w="80" w:type="dxa"/>
+              <w:bottom w:w="80" w:type="dxa"/>
+              <w:start w:w="120" w:type="dxa"/>
+              <w:end w:w="120" w:type="dxa"/>
+            </w:tcMar>
+          </w:tcPr>
+          <w:p>
+            <w:pPr>
+              <w:spacing w:after="0"/>
+            </w:pPr>
+            <w:r>
+              <w:rPr>
+                <w:rFonts w:ascii="Calibri" w:hAnsi="Calibri"/>
+                <w:b w:val="0"/>
+                <w:i w:val="0"/>
+                <w:color w:val="202124"/>
+                <w:sz w:val="17"/>
+              </w:rPr>
+              <w:t>Phase 2</w:t>
+            </w:r>
+          </w:p>
+        </w:tc>
+        <w:tc>
+          <w:tcPr>
+            <w:tcW w:type="dxa" w:w="4660"/>
+            <w:vAlign w:val="center"/>
+            <w:tcMar>
+              <w:top w:w="80" w:type="dxa"/>
+              <w:bottom w:w="80" w:type="dxa"/>
+              <w:start w:w="120" w:type="dxa"/>
+              <w:end w:w="120" w:type="dxa"/>
+            </w:tcMar>
+          </w:tcPr>
+          <w:p>
+            <w:pPr>
+              <w:spacing w:after="0"/>
+            </w:pPr>
+            <w:r>
+              <w:rPr>
+                <w:rFonts w:ascii="Calibri" w:hAnsi="Calibri"/>
+                <w:b w:val="0"/>
+                <w:i w:val="0"/>
+                <w:color w:val="202124"/>
+                <w:sz w:val="17"/>
+              </w:rPr>
+              <w:t>Compare methodology with C while holding the expanded population constant.</w:t>
+            </w:r>
+          </w:p>
+        </w:tc>
+      </w:tr>
+    </w:tbl>
+    <w:p>
+      <w:pPr>
+        <w:spacing w:after="0"/>
+      </w:pPr>
+    </w:p>
+    <w:p>
+      <w:pPr>
+        <w:spacing w:after="120" w:line="264" w:lineRule="auto"/>
+      </w:pPr>
+      <w:r>
+        <w:rPr>
+          <w:rFonts w:ascii="Calibri" w:hAnsi="Calibri"/>
+          <w:b w:val="0"/>
+          <w:i w:val="0"/>
+          <w:color w:val="202124"/>
+          <w:sz w:val="21"/>
+        </w:rPr>
+        <w:t>This is a useful additional comparison because A versus B and C versus D isolate the effect of changing the methodology, while A versus C and B versus D show how expanding the company population affects each approach. It therefore avoids attributing a performance difference to the model when it may instead result from a different sample.</w:t>
+      </w:r>
+    </w:p>
+    <w:p>
+      <w:pPr>
+        <w:spacing w:after="120" w:line="264" w:lineRule="auto"/>
+      </w:pPr>
+      <w:r>
+        <w:rPr>
+          <w:rFonts w:ascii="Calibri" w:hAnsi="Calibri"/>
+          <w:b w:val="0"/>
+          <w:i w:val="0"/>
+          <w:color w:val="202124"/>
+          <w:sz w:val="21"/>
+        </w:rPr>
+        <w:t>The bridge analysis will strengthen the connection between the phases, but it will not replace the final prospective test. The current two-sector Phase 2 specification, feature rules, calibration procedure, and sector thresholds should remain frozen. Company quarters after the 31 December 2025 financial cutoff should remain unexamined until their complete four-quarter outcomes are available.</w:t>
       </w:r>
     </w:p>
     <w:p>
@@ -7168,7 +7762,24 @@
           <w:color w:val="202124"/>
           <w:sz w:val="20"/>
         </w:rPr>
-        <w:t>Primary endpoint: four-quarter PR-AUC, with Phase 1's 0.397 benchmark treated as historical context rather than a guaranteed target.</w:t>
+        <w:t>Bridge endpoints: four-quarter PR-AUC, Brier score, calibration, recall, precision, and alert workload under both the fixed 20% alert-rate comparison and the recall-first operating policy.</w:t>
+      </w:r>
+    </w:p>
+    <w:p>
+      <w:pPr>
+        <w:pStyle w:val="ListBullet"/>
+        <w:spacing w:after="100" w:line="280" w:lineRule="auto"/>
+        <w:ind w:left="720" w:hanging="360"/>
+      </w:pPr>
+      <w:r>
+        <w:rPr>
+          <w:rFonts w:ascii="Calibri" w:hAnsi="Calibri"/>
+          <w:b w:val="0"/>
+          <w:i w:val="0"/>
+          <w:color w:val="202124"/>
+          <w:sz w:val="20"/>
+        </w:rPr>
+        <w:t>Primary prospective endpoint: four-quarter PR-AUC, with Phase 1's 0.397 benchmark treated as historical context rather than a guaranteed target.</w:t>
       </w:r>
     </w:p>
     <w:p>
@@ -7825,7 +8436,7 @@
       <w:jc w:val="right"/>
     </w:pPr>
     <w:r>
-      <w:t>Integrated research report | Evidence levels remain separate</w:t>
+      <w:t>Integrated financial risk analysis | Evidence levels remain separate</w:t>
     </w:r>
   </w:p>
 </w:ftr>
@@ -7846,7 +8457,7 @@
         <w:color w:val="667085"/>
         <w:sz w:val="17"/>
       </w:rPr>
-      <w:t>Corporate Financial Deterioration | Integrated Phase 1 + Phase 2 Report</w:t>
+      <w:t>Corporate Financial Deterioration | Integrated Financial Risk Research Analysis</w:t>
     </w:r>
   </w:p>
 </w:hdr>

</xml_diff>

<commit_message>
Remove legacy BI delivery and simplify repository
</commit_message>
<xml_diff>
--- a/reports/publication/Corporate_Financial_Deterioration_Combined_Phase1_Phase2_Research_Report.docx
+++ b/reports/publication/Corporate_Financial_Deterioration_Combined_Phase1_Phase2_Research_Report.docx
@@ -7122,7 +7122,7 @@
           <w:color w:val="202124"/>
           <w:sz w:val="21"/>
         </w:rPr>
-        <w:t>Before the final post-2025 prospective test matures, the project will conduct a pseudo-prospective backtest. Models will be trained using financial information available through 31 December 2023, predictions will be generated from information available at decision dates during 2024, and those predictions will be evaluated against four-quarter outcomes extending through 2025. This preserves the order in which information became available and provides a recent backtest. However, because the 2024–2025 period has already been observed during the broader project, the result will be treated as retrospective development evidence rather than a new untouched holdout.</w:t>
+        <w:t>Before the final post-2025 prospective test matures, the project will conduct a pseudo-prospective backtest. Models will be trained using financial information available through 31 December 2023, predictions will be generated from information available at decision dates during 2024, and those predictions will be evaluated against four-quarter outcomes extending through 2025. This preserves the order in which information became available and provides a recent backtest. However, because the 2024-2025 period has already been observed during the broader project, the result will be treated as retrospective development evidence rather than a new untouched holdout.</w:t>
       </w:r>
     </w:p>
     <w:p>
@@ -7137,7 +7137,7 @@
           <w:color w:val="202124"/>
           <w:sz w:val="21"/>
         </w:rPr>
-        <w:t>The project will also apply the Phase 1 methodology to the expanded 117-company population as part of a controlled Phase 1–Phase 2 bridge analysis. Four specifications will be evaluated using the same four-quarter deterioration label, temporal folds, eligible company-quarter observations, and performance measures:</w:t>
+        <w:t>The project will also apply the Phase 1 methodology to the expanded 117-company population as part of a controlled Phase 1-Phase 2 bridge analysis. Four specifications will be evaluated using the same four-quarter deterioration label, temporal folds, eligible company-quarter observations, and performance measures:</w:t>
       </w:r>
     </w:p>
     <w:tbl>

</xml_diff>

<commit_message>
Publish final Phase 2 optimization report
</commit_message>
<xml_diff>
--- a/reports/publication/Corporate_Financial_Deterioration_Combined_Phase1_Phase2_Research_Report.docx
+++ b/reports/publication/Corporate_Financial_Deterioration_Combined_Phase1_Phase2_Research_Report.docx
@@ -51,7 +51,7 @@
           <w:color w:val="2E75B6"/>
           <w:sz w:val="28"/>
         </w:rPr>
-        <w:t>Integrated Financial Risk Research Analysis: Phase 1 and Phase 2</w:t>
+        <w:t>Integrated Financial Risk Research Analysis</w:t>
       </w:r>
     </w:p>
     <w:p>
@@ -137,7 +137,32 @@
           <w:color w:val="202124"/>
           <w:sz w:val="21"/>
         </w:rPr>
-        <w:t>The sample increased to 117 active issuers; eligibility permitted defensible optional-field gaps; feature selection moved inside temporal folds; the registered model became an interpretable partially pooled logistic specification; calibration, sector thresholds, clustered uncertainty, monitoring, and company-level explanations were added. The primary reached 0.379 development PR-AUC and the constrained boosting challenger reached 0.412. These are development estimates and cannot be treated as a new final test.</w:t>
+        <w:t>The sample increased to 117 active issuers; eligibility permitted defensible optional-field gaps; feature selection moved inside temporal folds; the registered model became an interpretable partially pooled logistic specification; calibration, sector thresholds, clustered uncertainty, monitoring, and company-level explanations were added. The primary reached 0.379 development PR-AUC and the constrained boosting challenger reached 0.412.</w:t>
+      </w:r>
+    </w:p>
+    <w:p>
+      <w:pPr>
+        <w:spacing w:after="120" w:line="264" w:lineRule="auto"/>
+      </w:pPr>
+      <w:r>
+        <w:rPr>
+          <w:rFonts w:ascii="Calibri" w:hAnsi="Calibri"/>
+          <w:b/>
+          <w:i w:val="0"/>
+          <w:color w:val="17365D"/>
+          <w:sz w:val="21"/>
+        </w:rPr>
+        <w:t xml:space="preserve">What subsequent Phase 2 optimization achieved. </w:t>
+      </w:r>
+      <w:r>
+        <w:rPr>
+          <w:rFonts w:ascii="Calibri" w:hAnsi="Calibri"/>
+          <w:b w:val="0"/>
+          <w:i w:val="0"/>
+          <w:color w:val="202124"/>
+          <w:sz w:val="21"/>
+        </w:rPr>
+        <w:t>The same population, data, and four-quarter outcome were retained while additional model families and ensemble techniques were compared through rolling temporal validation. A frozen blend of pooled and sector-specific XGBoost achieved 0.841 ROC-AUC, 0.494 PR-AUC, and 85.7% recall on a sealed late-2024 out-of-time test whose outcomes matured during 2025.</w:t>
       </w:r>
     </w:p>
     <w:p>
@@ -162,7 +187,7 @@
           <w:color w:val="202124"/>
           <w:sz w:val="21"/>
         </w:rPr>
-        <w:t>The project has achieved a credible research prototype for recall-first analyst triage. Four quarters should remain the primary horizon. Two quarters is useful only as a near-term secondary flag because it reduced workload but also reduced PR-AUC, precision, and warning lead. Definitive Phase 2 performance remains unresolved until the post-2025 prospective outcomes mature.</w:t>
+        <w:t>The project has achieved a credible research prototype for recall-first analyst triage and a successful out-of-time model evaluation. Four quarters should remain the primary horizon. Two quarters is useful only as a near-term secondary flag because it reduced workload but also reduced PR-AUC, precision, and warning lead. A later matured period is still needed to determine whether the improvement repeats over time.</w:t>
       </w:r>
     </w:p>
     <w:tbl>
@@ -375,7 +400,7 @@
                 <w:color w:val="202124"/>
                 <w:sz w:val="17"/>
               </w:rPr>
-              <w:t>2. Phase 2 model development</w:t>
+              <w:t>2. Phase 2 initial model development</w:t>
             </w:r>
           </w:p>
         </w:tc>
@@ -458,7 +483,90 @@
                 <w:color w:val="202124"/>
                 <w:sz w:val="17"/>
               </w:rPr>
-              <w:t>3. Two-quarter sensitivity</w:t>
+              <w:t>3. Phase 2 model optimization</w:t>
+            </w:r>
+          </w:p>
+        </w:tc>
+        <w:tc>
+          <w:tcPr>
+            <w:tcW w:type="dxa" w:w="2450"/>
+            <w:vAlign w:val="center"/>
+            <w:tcMar>
+              <w:top w:w="80" w:type="dxa"/>
+              <w:bottom w:w="80" w:type="dxa"/>
+              <w:start w:w="120" w:type="dxa"/>
+              <w:end w:w="120" w:type="dxa"/>
+            </w:tcMar>
+          </w:tcPr>
+          <w:p>
+            <w:pPr>
+              <w:spacing w:after="0"/>
+            </w:pPr>
+            <w:r>
+              <w:rPr>
+                <w:rFonts w:ascii="Calibri" w:hAnsi="Calibri"/>
+                <w:b w:val="0"/>
+                <w:i w:val="0"/>
+                <w:color w:val="202124"/>
+                <w:sz w:val="17"/>
+              </w:rPr>
+              <w:t>Sealed late-2024 out-of-time test</w:t>
+            </w:r>
+          </w:p>
+        </w:tc>
+        <w:tc>
+          <w:tcPr>
+            <w:tcW w:type="dxa" w:w="4410"/>
+            <w:vAlign w:val="center"/>
+            <w:tcMar>
+              <w:top w:w="80" w:type="dxa"/>
+              <w:bottom w:w="80" w:type="dxa"/>
+              <w:start w:w="120" w:type="dxa"/>
+              <w:end w:w="120" w:type="dxa"/>
+            </w:tcMar>
+          </w:tcPr>
+          <w:p>
+            <w:pPr>
+              <w:spacing w:after="0"/>
+            </w:pPr>
+            <w:r>
+              <w:rPr>
+                <w:rFonts w:ascii="Calibri" w:hAnsi="Calibri"/>
+                <w:b w:val="0"/>
+                <w:i w:val="0"/>
+                <w:color w:val="202124"/>
+                <w:sz w:val="17"/>
+              </w:rPr>
+              <w:t>Final test evidence for the frozen 117-company optimization experiment</w:t>
+            </w:r>
+          </w:p>
+        </w:tc>
+      </w:tr>
+      <w:tr>
+        <w:tc>
+          <w:tcPr>
+            <w:tcW w:type="dxa" w:w="2500"/>
+            <w:vAlign w:val="center"/>
+            <w:tcMar>
+              <w:top w:w="80" w:type="dxa"/>
+              <w:bottom w:w="80" w:type="dxa"/>
+              <w:start w:w="120" w:type="dxa"/>
+              <w:end w:w="120" w:type="dxa"/>
+            </w:tcMar>
+          </w:tcPr>
+          <w:p>
+            <w:pPr>
+              <w:spacing w:after="0"/>
+            </w:pPr>
+            <w:r>
+              <w:rPr>
+                <w:rFonts w:ascii="Calibri" w:hAnsi="Calibri"/>
+                <w:b w:val="0"/>
+                <w:i w:val="0"/>
+                <w:color w:val="202124"/>
+                <w:sz w:val="17"/>
+              </w:rPr>
+              <w:t>4. Two-quarter sensitivity</w:t>
             </w:r>
           </w:p>
         </w:tc>
@@ -541,7 +649,7 @@
                 <w:color w:val="202124"/>
                 <w:sz w:val="17"/>
               </w:rPr>
-              <w:t>4. Post-2025 prospective test</w:t>
+              <w:t>5. Post-2025 prospective test</w:t>
             </w:r>
           </w:p>
         </w:tc>
@@ -595,7 +703,7 @@
                 <w:color w:val="202124"/>
                 <w:sz w:val="17"/>
               </w:rPr>
-              <w:t>Only this can support a new final generalization claim</w:t>
+              <w:t>Provides an additional future-period replication after outcomes mature</w:t>
             </w:r>
           </w:p>
         </w:tc>
@@ -6109,7 +6217,7 @@
           <w:color w:val="17365D"/>
           <w:sz w:val="32"/>
         </w:rPr>
-        <w:t>14. Phase 1-to-Phase 2 performance comparison</w:t>
+        <w:t>14. Phase 1-to-initial-Phase 2 performance comparison</w:t>
       </w:r>
     </w:p>
     <w:p>
@@ -6124,7 +6232,7 @@
           <w:color w:val="202124"/>
           <w:sz w:val="21"/>
         </w:rPr>
-        <w:t>Phase 2 did not establish a conclusive performance improvement over Phase 1 because the numbers come from different populations and evidence levels. Phase 1's 0.397 PR-AUC is a one-time final holdout result. Phase 2's 0.379 primary and 0.412 challenger are development OOF estimates after expanding the population and changing the modeling procedure. The challenger exceeds the numerical Phase 1 benchmark, while the interpretable primary is slightly lower, but neither comparison is a valid replacement for the unopened prospective test.</w:t>
+        <w:t>The initial Phase 2 analysis did not establish a conclusive performance improvement over Phase 1 because the numbers came from different populations and evidence levels. Phase 1's 0.397 PR-AUC is a one-time final holdout result. The initial Phase 2 estimates of 0.379 for the primary model and 0.412 for the challenger are development OOF results after expanding the population and changing the modeling procedure. The challenger exceeded the numerical Phase 1 benchmark, while the interpretable primary was slightly lower, but neither comparison replaced an out-of-time test.</w:t>
       </w:r>
     </w:p>
     <w:tbl>
@@ -6226,7 +6334,7 @@
                 <w:color w:val="17365D"/>
                 <w:sz w:val="18"/>
               </w:rPr>
-              <w:t>Phase 2</w:t>
+              <w:t>Initial Phase 2</w:t>
             </w:r>
           </w:p>
         </w:tc>
@@ -6447,7 +6555,7 @@
                 <w:color w:val="202124"/>
                 <w:sz w:val="17"/>
               </w:rPr>
-              <w:t>Post-2025 test unopened</w:t>
+              <w:t>Development OOF only at that stage</w:t>
             </w:r>
           </w:p>
         </w:tc>
@@ -6474,7 +6582,7 @@
                 <w:color w:val="202124"/>
                 <w:sz w:val="17"/>
               </w:rPr>
-              <w:t>Phase 2 final generalization unresolved</w:t>
+              <w:t>Later out-of-time evidence is reported in Section 16</w:t>
             </w:r>
           </w:p>
         </w:tc>
@@ -6584,7 +6692,7 @@
                 <w:color w:val="202124"/>
                 <w:sz w:val="17"/>
               </w:rPr>
-              <w:t>No defensible claim of decline or improvement</w:t>
+              <w:t>No defensible improvement claim at that stage</w:t>
             </w:r>
           </w:p>
         </w:tc>
@@ -6694,7 +6802,7 @@
                 <w:color w:val="202124"/>
                 <w:sz w:val="17"/>
               </w:rPr>
-              <w:t>Promising, pending final test</w:t>
+              <w:t>Promising result that motivated later optimization</w:t>
             </w:r>
           </w:p>
         </w:tc>
@@ -6938,7 +7046,832 @@
           <w:color w:val="17365D"/>
           <w:sz w:val="32"/>
         </w:rPr>
-        <w:t>15. Limitations and governance</w:t>
+        <w:t>15. Phase 2 model improvement and ensemble design</w:t>
+      </w:r>
+    </w:p>
+    <w:p>
+      <w:pPr>
+        <w:spacing w:after="120" w:line="264" w:lineRule="auto"/>
+      </w:pPr>
+      <w:r>
+        <w:rPr>
+          <w:rFonts w:ascii="Calibri" w:hAnsi="Calibri"/>
+          <w:b w:val="0"/>
+          <w:i w:val="0"/>
+          <w:color w:val="202124"/>
+          <w:sz w:val="21"/>
+        </w:rPr>
+        <w:t>The next Phase 2 step held the 117-company population, public-data inputs, four-quarter deterioration outcome, and point-in-time rules constant. This made the experiment a controlled model improvement exercise: performance changes were driven primarily by the modeling and validation process rather than by adding sectors, companies, or a different target.</w:t>
+      </w:r>
+    </w:p>
+    <w:p>
+      <w:pPr>
+        <w:spacing w:after="120" w:line="264" w:lineRule="auto"/>
+      </w:pPr>
+      <w:r>
+        <w:rPr>
+          <w:rFonts w:ascii="Calibri" w:hAnsi="Calibri"/>
+          <w:b w:val="0"/>
+          <w:i w:val="0"/>
+          <w:color w:val="202124"/>
+          <w:sz w:val="21"/>
+        </w:rPr>
+        <w:t>The comparison covered regularized logistic regression, random forest, histogram gradient boosting, XGBoost, and a nonlinear support-vector challenger. Logistic regression preserved a transparent linear benchmark. Random forest and boosting allowed financial variables to matter through thresholds and interactions—for example, weak cash flow becoming more concerning when leverage is elevated—without requiring those relationships to be specified in advance.</w:t>
+      </w:r>
+    </w:p>
+    <w:p>
+      <w:pPr>
+        <w:spacing w:after="120" w:line="264" w:lineRule="auto"/>
+      </w:pPr>
+      <w:r>
+        <w:rPr>
+          <w:rFonts w:ascii="Calibri" w:hAnsi="Calibri"/>
+          <w:b w:val="0"/>
+          <w:i w:val="0"/>
+          <w:color w:val="202124"/>
+          <w:sz w:val="21"/>
+        </w:rPr>
+        <w:t>The ensemble experiments included equal and rank averaging, averaging the strongest models, selecting a recent-window winner, performance-weighted averaging, time-adaptive weighting, stacking, and focused blends. The time-adaptive approach used only completed earlier validation windows when assigning weights, so it could not choose a model using the outcome of the period being predicted. Broad averaging and hard window-by-window switching were not consistently better: weaker models diluted strong predictions, and a model that won one period did not necessarily remain strongest in the next.</w:t>
+      </w:r>
+    </w:p>
+    <w:p>
+      <w:pPr>
+        <w:spacing w:after="120" w:line="264" w:lineRule="auto"/>
+      </w:pPr>
+      <w:r>
+        <w:rPr>
+          <w:rFonts w:ascii="Calibri" w:hAnsi="Calibri"/>
+          <w:b w:val="0"/>
+          <w:i w:val="0"/>
+          <w:color w:val="202124"/>
+          <w:sz w:val="21"/>
+        </w:rPr>
+        <w:t>The selected ensemble assigns 60% weight to pooled XGBoost and 40% to sector-specific XGBoost. The pooled component learns relationships supported across both sectors and benefits the smaller Utility sample. The sector-specific component allows Consumer Discretionary and Utility relationships to differ. The blend therefore balances statistical stability with economically reasonable sector flexibility.</w:t>
+      </w:r>
+    </w:p>
+    <w:p>
+      <w:pPr>
+        <w:pStyle w:val="Heading1"/>
+        <w:keepNext/>
+      </w:pPr>
+      <w:r>
+        <w:rPr>
+          <w:rFonts w:ascii="Calibri" w:hAnsi="Calibri"/>
+          <w:b/>
+          <w:i w:val="0"/>
+          <w:color w:val="17365D"/>
+          <w:sz w:val="32"/>
+        </w:rPr>
+        <w:t>16. Optimized model results and comparison</w:t>
+      </w:r>
+    </w:p>
+    <w:tbl>
+      <w:tblPr>
+        <w:tblStyle w:val="TableGrid"/>
+        <w:tblW w:type="dxa" w:w="9360"/>
+        <w:jc w:val="left"/>
+        <w:tblLayout w:type="fixed"/>
+        <w:tblLook w:firstColumn="1" w:firstRow="1" w:lastColumn="0" w:lastRow="0" w:noHBand="0" w:noVBand="1" w:val="04A0"/>
+        <w:tblInd w:w="120" w:type="dxa"/>
+      </w:tblPr>
+      <w:tblGrid>
+        <w:gridCol w:w="3200"/>
+        <w:gridCol w:w="1230"/>
+        <w:gridCol w:w="1230"/>
+        <w:gridCol w:w="1230"/>
+        <w:gridCol w:w="1230"/>
+        <w:gridCol w:w="1240"/>
+      </w:tblGrid>
+      <w:tr>
+        <w:trPr>
+          <w:tblHeader/>
+        </w:trPr>
+        <w:tc>
+          <w:tcPr>
+            <w:tcW w:type="dxa" w:w="3200"/>
+            <w:shd w:fill="EAF1F8"/>
+            <w:vAlign w:val="center"/>
+            <w:tcMar>
+              <w:top w:w="80" w:type="dxa"/>
+              <w:bottom w:w="80" w:type="dxa"/>
+              <w:start w:w="120" w:type="dxa"/>
+              <w:end w:w="120" w:type="dxa"/>
+            </w:tcMar>
+          </w:tcPr>
+          <w:p>
+            <w:pPr>
+              <w:spacing w:after="0"/>
+            </w:pPr>
+            <w:r>
+              <w:rPr>
+                <w:rFonts w:ascii="Calibri" w:hAnsi="Calibri"/>
+                <w:b/>
+                <w:i w:val="0"/>
+                <w:color w:val="17365D"/>
+                <w:sz w:val="18"/>
+              </w:rPr>
+              <w:t>Model evidence</w:t>
+            </w:r>
+          </w:p>
+        </w:tc>
+        <w:tc>
+          <w:tcPr>
+            <w:tcW w:type="dxa" w:w="1230"/>
+            <w:shd w:fill="EAF1F8"/>
+            <w:vAlign w:val="center"/>
+            <w:tcMar>
+              <w:top w:w="80" w:type="dxa"/>
+              <w:bottom w:w="80" w:type="dxa"/>
+              <w:start w:w="120" w:type="dxa"/>
+              <w:end w:w="120" w:type="dxa"/>
+            </w:tcMar>
+          </w:tcPr>
+          <w:p>
+            <w:pPr>
+              <w:spacing w:after="0"/>
+            </w:pPr>
+            <w:r>
+              <w:rPr>
+                <w:rFonts w:ascii="Calibri" w:hAnsi="Calibri"/>
+                <w:b/>
+                <w:i w:val="0"/>
+                <w:color w:val="17365D"/>
+                <w:sz w:val="18"/>
+              </w:rPr>
+              <w:t>ROC-AUC</w:t>
+            </w:r>
+          </w:p>
+        </w:tc>
+        <w:tc>
+          <w:tcPr>
+            <w:tcW w:type="dxa" w:w="1230"/>
+            <w:shd w:fill="EAF1F8"/>
+            <w:vAlign w:val="center"/>
+            <w:tcMar>
+              <w:top w:w="80" w:type="dxa"/>
+              <w:bottom w:w="80" w:type="dxa"/>
+              <w:start w:w="120" w:type="dxa"/>
+              <w:end w:w="120" w:type="dxa"/>
+            </w:tcMar>
+          </w:tcPr>
+          <w:p>
+            <w:pPr>
+              <w:spacing w:after="0"/>
+            </w:pPr>
+            <w:r>
+              <w:rPr>
+                <w:rFonts w:ascii="Calibri" w:hAnsi="Calibri"/>
+                <w:b/>
+                <w:i w:val="0"/>
+                <w:color w:val="17365D"/>
+                <w:sz w:val="18"/>
+              </w:rPr>
+              <w:t>PR-AUC</w:t>
+            </w:r>
+          </w:p>
+        </w:tc>
+        <w:tc>
+          <w:tcPr>
+            <w:tcW w:type="dxa" w:w="1230"/>
+            <w:shd w:fill="EAF1F8"/>
+            <w:vAlign w:val="center"/>
+            <w:tcMar>
+              <w:top w:w="80" w:type="dxa"/>
+              <w:bottom w:w="80" w:type="dxa"/>
+              <w:start w:w="120" w:type="dxa"/>
+              <w:end w:w="120" w:type="dxa"/>
+            </w:tcMar>
+          </w:tcPr>
+          <w:p>
+            <w:pPr>
+              <w:spacing w:after="0"/>
+            </w:pPr>
+            <w:r>
+              <w:rPr>
+                <w:rFonts w:ascii="Calibri" w:hAnsi="Calibri"/>
+                <w:b/>
+                <w:i w:val="0"/>
+                <w:color w:val="17365D"/>
+                <w:sz w:val="18"/>
+              </w:rPr>
+              <w:t>Recall</w:t>
+            </w:r>
+          </w:p>
+        </w:tc>
+        <w:tc>
+          <w:tcPr>
+            <w:tcW w:type="dxa" w:w="1230"/>
+            <w:shd w:fill="EAF1F8"/>
+            <w:vAlign w:val="center"/>
+            <w:tcMar>
+              <w:top w:w="80" w:type="dxa"/>
+              <w:bottom w:w="80" w:type="dxa"/>
+              <w:start w:w="120" w:type="dxa"/>
+              <w:end w:w="120" w:type="dxa"/>
+            </w:tcMar>
+          </w:tcPr>
+          <w:p>
+            <w:pPr>
+              <w:spacing w:after="0"/>
+            </w:pPr>
+            <w:r>
+              <w:rPr>
+                <w:rFonts w:ascii="Calibri" w:hAnsi="Calibri"/>
+                <w:b/>
+                <w:i w:val="0"/>
+                <w:color w:val="17365D"/>
+                <w:sz w:val="18"/>
+              </w:rPr>
+              <w:t>Precision</w:t>
+            </w:r>
+          </w:p>
+        </w:tc>
+        <w:tc>
+          <w:tcPr>
+            <w:tcW w:type="dxa" w:w="1240"/>
+            <w:shd w:fill="EAF1F8"/>
+            <w:vAlign w:val="center"/>
+            <w:tcMar>
+              <w:top w:w="80" w:type="dxa"/>
+              <w:bottom w:w="80" w:type="dxa"/>
+              <w:start w:w="120" w:type="dxa"/>
+              <w:end w:w="120" w:type="dxa"/>
+            </w:tcMar>
+          </w:tcPr>
+          <w:p>
+            <w:pPr>
+              <w:spacing w:after="0"/>
+            </w:pPr>
+            <w:r>
+              <w:rPr>
+                <w:rFonts w:ascii="Calibri" w:hAnsi="Calibri"/>
+                <w:b/>
+                <w:i w:val="0"/>
+                <w:color w:val="17365D"/>
+                <w:sz w:val="18"/>
+              </w:rPr>
+              <w:t>Alert rate</w:t>
+            </w:r>
+          </w:p>
+        </w:tc>
+      </w:tr>
+      <w:tr>
+        <w:tc>
+          <w:tcPr>
+            <w:tcW w:type="dxa" w:w="3200"/>
+            <w:vAlign w:val="center"/>
+            <w:tcMar>
+              <w:top w:w="80" w:type="dxa"/>
+              <w:bottom w:w="80" w:type="dxa"/>
+              <w:start w:w="120" w:type="dxa"/>
+              <w:end w:w="120" w:type="dxa"/>
+            </w:tcMar>
+          </w:tcPr>
+          <w:p>
+            <w:pPr>
+              <w:spacing w:after="0"/>
+            </w:pPr>
+            <w:r>
+              <w:rPr>
+                <w:rFonts w:ascii="Calibri" w:hAnsi="Calibri"/>
+                <w:b w:val="0"/>
+                <w:i w:val="0"/>
+                <w:color w:val="202124"/>
+                <w:sz w:val="17"/>
+              </w:rPr>
+              <w:t>Initial Phase 2 boosting — development OOF</w:t>
+            </w:r>
+          </w:p>
+        </w:tc>
+        <w:tc>
+          <w:tcPr>
+            <w:tcW w:type="dxa" w:w="1230"/>
+            <w:vAlign w:val="center"/>
+            <w:tcMar>
+              <w:top w:w="80" w:type="dxa"/>
+              <w:bottom w:w="80" w:type="dxa"/>
+              <w:start w:w="120" w:type="dxa"/>
+              <w:end w:w="120" w:type="dxa"/>
+            </w:tcMar>
+          </w:tcPr>
+          <w:p>
+            <w:pPr>
+              <w:spacing w:after="0"/>
+            </w:pPr>
+            <w:r>
+              <w:rPr>
+                <w:rFonts w:ascii="Calibri" w:hAnsi="Calibri"/>
+                <w:b w:val="0"/>
+                <w:i w:val="0"/>
+                <w:color w:val="202124"/>
+                <w:sz w:val="17"/>
+              </w:rPr>
+              <w:t>0.716</w:t>
+            </w:r>
+          </w:p>
+        </w:tc>
+        <w:tc>
+          <w:tcPr>
+            <w:tcW w:type="dxa" w:w="1230"/>
+            <w:vAlign w:val="center"/>
+            <w:tcMar>
+              <w:top w:w="80" w:type="dxa"/>
+              <w:bottom w:w="80" w:type="dxa"/>
+              <w:start w:w="120" w:type="dxa"/>
+              <w:end w:w="120" w:type="dxa"/>
+            </w:tcMar>
+          </w:tcPr>
+          <w:p>
+            <w:pPr>
+              <w:spacing w:after="0"/>
+            </w:pPr>
+            <w:r>
+              <w:rPr>
+                <w:rFonts w:ascii="Calibri" w:hAnsi="Calibri"/>
+                <w:b w:val="0"/>
+                <w:i w:val="0"/>
+                <w:color w:val="202124"/>
+                <w:sz w:val="17"/>
+              </w:rPr>
+              <w:t>0.412</w:t>
+            </w:r>
+          </w:p>
+        </w:tc>
+        <w:tc>
+          <w:tcPr>
+            <w:tcW w:type="dxa" w:w="1230"/>
+            <w:vAlign w:val="center"/>
+            <w:tcMar>
+              <w:top w:w="80" w:type="dxa"/>
+              <w:bottom w:w="80" w:type="dxa"/>
+              <w:start w:w="120" w:type="dxa"/>
+              <w:end w:w="120" w:type="dxa"/>
+            </w:tcMar>
+          </w:tcPr>
+          <w:p>
+            <w:pPr>
+              <w:spacing w:after="0"/>
+            </w:pPr>
+            <w:r>
+              <w:rPr>
+                <w:rFonts w:ascii="Calibri" w:hAnsi="Calibri"/>
+                <w:b w:val="0"/>
+                <w:i w:val="0"/>
+                <w:color w:val="202124"/>
+                <w:sz w:val="17"/>
+              </w:rPr>
+              <w:t>80.5%</w:t>
+            </w:r>
+          </w:p>
+        </w:tc>
+        <w:tc>
+          <w:tcPr>
+            <w:tcW w:type="dxa" w:w="1230"/>
+            <w:vAlign w:val="center"/>
+            <w:tcMar>
+              <w:top w:w="80" w:type="dxa"/>
+              <w:bottom w:w="80" w:type="dxa"/>
+              <w:start w:w="120" w:type="dxa"/>
+              <w:end w:w="120" w:type="dxa"/>
+            </w:tcMar>
+          </w:tcPr>
+          <w:p>
+            <w:pPr>
+              <w:spacing w:after="0"/>
+            </w:pPr>
+            <w:r>
+              <w:rPr>
+                <w:rFonts w:ascii="Calibri" w:hAnsi="Calibri"/>
+                <w:b w:val="0"/>
+                <w:i w:val="0"/>
+                <w:color w:val="202124"/>
+                <w:sz w:val="17"/>
+              </w:rPr>
+              <w:t>29.8%</w:t>
+            </w:r>
+          </w:p>
+        </w:tc>
+        <w:tc>
+          <w:tcPr>
+            <w:tcW w:type="dxa" w:w="1240"/>
+            <w:vAlign w:val="center"/>
+            <w:tcMar>
+              <w:top w:w="80" w:type="dxa"/>
+              <w:bottom w:w="80" w:type="dxa"/>
+              <w:start w:w="120" w:type="dxa"/>
+              <w:end w:w="120" w:type="dxa"/>
+            </w:tcMar>
+          </w:tcPr>
+          <w:p>
+            <w:pPr>
+              <w:spacing w:after="0"/>
+            </w:pPr>
+            <w:r>
+              <w:rPr>
+                <w:rFonts w:ascii="Calibri" w:hAnsi="Calibri"/>
+                <w:b w:val="0"/>
+                <w:i w:val="0"/>
+                <w:color w:val="202124"/>
+                <w:sz w:val="17"/>
+              </w:rPr>
+              <w:t>57.6%</w:t>
+            </w:r>
+          </w:p>
+        </w:tc>
+      </w:tr>
+      <w:tr>
+        <w:tc>
+          <w:tcPr>
+            <w:tcW w:type="dxa" w:w="3200"/>
+            <w:vAlign w:val="center"/>
+            <w:tcMar>
+              <w:top w:w="80" w:type="dxa"/>
+              <w:bottom w:w="80" w:type="dxa"/>
+              <w:start w:w="120" w:type="dxa"/>
+              <w:end w:w="120" w:type="dxa"/>
+            </w:tcMar>
+          </w:tcPr>
+          <w:p>
+            <w:pPr>
+              <w:spacing w:after="0"/>
+            </w:pPr>
+            <w:r>
+              <w:rPr>
+                <w:rFonts w:ascii="Calibri" w:hAnsi="Calibri"/>
+                <w:b w:val="0"/>
+                <w:i w:val="0"/>
+                <w:color w:val="202124"/>
+                <w:sz w:val="17"/>
+              </w:rPr>
+              <w:t>Optimized ensemble — development OOF</w:t>
+            </w:r>
+          </w:p>
+        </w:tc>
+        <w:tc>
+          <w:tcPr>
+            <w:tcW w:type="dxa" w:w="1230"/>
+            <w:vAlign w:val="center"/>
+            <w:tcMar>
+              <w:top w:w="80" w:type="dxa"/>
+              <w:bottom w:w="80" w:type="dxa"/>
+              <w:start w:w="120" w:type="dxa"/>
+              <w:end w:w="120" w:type="dxa"/>
+            </w:tcMar>
+          </w:tcPr>
+          <w:p>
+            <w:pPr>
+              <w:spacing w:after="0"/>
+            </w:pPr>
+            <w:r>
+              <w:rPr>
+                <w:rFonts w:ascii="Calibri" w:hAnsi="Calibri"/>
+                <w:b w:val="0"/>
+                <w:i w:val="0"/>
+                <w:color w:val="202124"/>
+                <w:sz w:val="17"/>
+              </w:rPr>
+              <w:t>0.760</w:t>
+            </w:r>
+          </w:p>
+        </w:tc>
+        <w:tc>
+          <w:tcPr>
+            <w:tcW w:type="dxa" w:w="1230"/>
+            <w:vAlign w:val="center"/>
+            <w:tcMar>
+              <w:top w:w="80" w:type="dxa"/>
+              <w:bottom w:w="80" w:type="dxa"/>
+              <w:start w:w="120" w:type="dxa"/>
+              <w:end w:w="120" w:type="dxa"/>
+            </w:tcMar>
+          </w:tcPr>
+          <w:p>
+            <w:pPr>
+              <w:spacing w:after="0"/>
+            </w:pPr>
+            <w:r>
+              <w:rPr>
+                <w:rFonts w:ascii="Calibri" w:hAnsi="Calibri"/>
+                <w:b w:val="0"/>
+                <w:i w:val="0"/>
+                <w:color w:val="202124"/>
+                <w:sz w:val="17"/>
+              </w:rPr>
+              <w:t>0.462</w:t>
+            </w:r>
+          </w:p>
+        </w:tc>
+        <w:tc>
+          <w:tcPr>
+            <w:tcW w:type="dxa" w:w="1230"/>
+            <w:vAlign w:val="center"/>
+            <w:tcMar>
+              <w:top w:w="80" w:type="dxa"/>
+              <w:bottom w:w="80" w:type="dxa"/>
+              <w:start w:w="120" w:type="dxa"/>
+              <w:end w:w="120" w:type="dxa"/>
+            </w:tcMar>
+          </w:tcPr>
+          <w:p>
+            <w:pPr>
+              <w:spacing w:after="0"/>
+            </w:pPr>
+            <w:r>
+              <w:rPr>
+                <w:rFonts w:ascii="Calibri" w:hAnsi="Calibri"/>
+                <w:b w:val="0"/>
+                <w:i w:val="0"/>
+                <w:color w:val="202124"/>
+                <w:sz w:val="17"/>
+              </w:rPr>
+              <w:t>80.5%</w:t>
+            </w:r>
+          </w:p>
+        </w:tc>
+        <w:tc>
+          <w:tcPr>
+            <w:tcW w:type="dxa" w:w="1230"/>
+            <w:vAlign w:val="center"/>
+            <w:tcMar>
+              <w:top w:w="80" w:type="dxa"/>
+              <w:bottom w:w="80" w:type="dxa"/>
+              <w:start w:w="120" w:type="dxa"/>
+              <w:end w:w="120" w:type="dxa"/>
+            </w:tcMar>
+          </w:tcPr>
+          <w:p>
+            <w:pPr>
+              <w:spacing w:after="0"/>
+            </w:pPr>
+            <w:r>
+              <w:rPr>
+                <w:rFonts w:ascii="Calibri" w:hAnsi="Calibri"/>
+                <w:b w:val="0"/>
+                <w:i w:val="0"/>
+                <w:color w:val="202124"/>
+                <w:sz w:val="17"/>
+              </w:rPr>
+              <w:t>33.4%</w:t>
+            </w:r>
+          </w:p>
+        </w:tc>
+        <w:tc>
+          <w:tcPr>
+            <w:tcW w:type="dxa" w:w="1240"/>
+            <w:vAlign w:val="center"/>
+            <w:tcMar>
+              <w:top w:w="80" w:type="dxa"/>
+              <w:bottom w:w="80" w:type="dxa"/>
+              <w:start w:w="120" w:type="dxa"/>
+              <w:end w:w="120" w:type="dxa"/>
+            </w:tcMar>
+          </w:tcPr>
+          <w:p>
+            <w:pPr>
+              <w:spacing w:after="0"/>
+            </w:pPr>
+            <w:r>
+              <w:rPr>
+                <w:rFonts w:ascii="Calibri" w:hAnsi="Calibri"/>
+                <w:b w:val="0"/>
+                <w:i w:val="0"/>
+                <w:color w:val="202124"/>
+                <w:sz w:val="17"/>
+              </w:rPr>
+              <w:t>51.3%</w:t>
+            </w:r>
+          </w:p>
+        </w:tc>
+      </w:tr>
+      <w:tr>
+        <w:tc>
+          <w:tcPr>
+            <w:tcW w:type="dxa" w:w="3200"/>
+            <w:vAlign w:val="center"/>
+            <w:tcMar>
+              <w:top w:w="80" w:type="dxa"/>
+              <w:bottom w:w="80" w:type="dxa"/>
+              <w:start w:w="120" w:type="dxa"/>
+              <w:end w:w="120" w:type="dxa"/>
+            </w:tcMar>
+          </w:tcPr>
+          <w:p>
+            <w:pPr>
+              <w:spacing w:after="0"/>
+            </w:pPr>
+            <w:r>
+              <w:rPr>
+                <w:rFonts w:ascii="Calibri" w:hAnsi="Calibri"/>
+                <w:b w:val="0"/>
+                <w:i w:val="0"/>
+                <w:color w:val="202124"/>
+                <w:sz w:val="17"/>
+              </w:rPr>
+              <w:t>Optimized ensemble — sealed late-2024 test</w:t>
+            </w:r>
+          </w:p>
+        </w:tc>
+        <w:tc>
+          <w:tcPr>
+            <w:tcW w:type="dxa" w:w="1230"/>
+            <w:vAlign w:val="center"/>
+            <w:tcMar>
+              <w:top w:w="80" w:type="dxa"/>
+              <w:bottom w:w="80" w:type="dxa"/>
+              <w:start w:w="120" w:type="dxa"/>
+              <w:end w:w="120" w:type="dxa"/>
+            </w:tcMar>
+          </w:tcPr>
+          <w:p>
+            <w:pPr>
+              <w:spacing w:after="0"/>
+            </w:pPr>
+            <w:r>
+              <w:rPr>
+                <w:rFonts w:ascii="Calibri" w:hAnsi="Calibri"/>
+                <w:b w:val="0"/>
+                <w:i w:val="0"/>
+                <w:color w:val="202124"/>
+                <w:sz w:val="17"/>
+              </w:rPr>
+              <w:t>0.841</w:t>
+            </w:r>
+          </w:p>
+        </w:tc>
+        <w:tc>
+          <w:tcPr>
+            <w:tcW w:type="dxa" w:w="1230"/>
+            <w:vAlign w:val="center"/>
+            <w:tcMar>
+              <w:top w:w="80" w:type="dxa"/>
+              <w:bottom w:w="80" w:type="dxa"/>
+              <w:start w:w="120" w:type="dxa"/>
+              <w:end w:w="120" w:type="dxa"/>
+            </w:tcMar>
+          </w:tcPr>
+          <w:p>
+            <w:pPr>
+              <w:spacing w:after="0"/>
+            </w:pPr>
+            <w:r>
+              <w:rPr>
+                <w:rFonts w:ascii="Calibri" w:hAnsi="Calibri"/>
+                <w:b w:val="0"/>
+                <w:i w:val="0"/>
+                <w:color w:val="202124"/>
+                <w:sz w:val="17"/>
+              </w:rPr>
+              <w:t>0.494</w:t>
+            </w:r>
+          </w:p>
+        </w:tc>
+        <w:tc>
+          <w:tcPr>
+            <w:tcW w:type="dxa" w:w="1230"/>
+            <w:vAlign w:val="center"/>
+            <w:tcMar>
+              <w:top w:w="80" w:type="dxa"/>
+              <w:bottom w:w="80" w:type="dxa"/>
+              <w:start w:w="120" w:type="dxa"/>
+              <w:end w:w="120" w:type="dxa"/>
+            </w:tcMar>
+          </w:tcPr>
+          <w:p>
+            <w:pPr>
+              <w:spacing w:after="0"/>
+            </w:pPr>
+            <w:r>
+              <w:rPr>
+                <w:rFonts w:ascii="Calibri" w:hAnsi="Calibri"/>
+                <w:b w:val="0"/>
+                <w:i w:val="0"/>
+                <w:color w:val="202124"/>
+                <w:sz w:val="17"/>
+              </w:rPr>
+              <w:t>85.7%</w:t>
+            </w:r>
+          </w:p>
+        </w:tc>
+        <w:tc>
+          <w:tcPr>
+            <w:tcW w:type="dxa" w:w="1230"/>
+            <w:vAlign w:val="center"/>
+            <w:tcMar>
+              <w:top w:w="80" w:type="dxa"/>
+              <w:bottom w:w="80" w:type="dxa"/>
+              <w:start w:w="120" w:type="dxa"/>
+              <w:end w:w="120" w:type="dxa"/>
+            </w:tcMar>
+          </w:tcPr>
+          <w:p>
+            <w:pPr>
+              <w:spacing w:after="0"/>
+            </w:pPr>
+            <w:r>
+              <w:rPr>
+                <w:rFonts w:ascii="Calibri" w:hAnsi="Calibri"/>
+                <w:b w:val="0"/>
+                <w:i w:val="0"/>
+                <w:color w:val="202124"/>
+                <w:sz w:val="17"/>
+              </w:rPr>
+              <w:t>26.4%</w:t>
+            </w:r>
+          </w:p>
+        </w:tc>
+        <w:tc>
+          <w:tcPr>
+            <w:tcW w:type="dxa" w:w="1240"/>
+            <w:vAlign w:val="center"/>
+            <w:tcMar>
+              <w:top w:w="80" w:type="dxa"/>
+              <w:bottom w:w="80" w:type="dxa"/>
+              <w:start w:w="120" w:type="dxa"/>
+              <w:end w:w="120" w:type="dxa"/>
+            </w:tcMar>
+          </w:tcPr>
+          <w:p>
+            <w:pPr>
+              <w:spacing w:after="0"/>
+            </w:pPr>
+            <w:r>
+              <w:rPr>
+                <w:rFonts w:ascii="Calibri" w:hAnsi="Calibri"/>
+                <w:b w:val="0"/>
+                <w:i w:val="0"/>
+                <w:color w:val="202124"/>
+                <w:sz w:val="17"/>
+              </w:rPr>
+              <w:t>51.1%</w:t>
+            </w:r>
+          </w:p>
+        </w:tc>
+      </w:tr>
+    </w:tbl>
+    <w:p>
+      <w:pPr>
+        <w:spacing w:after="0"/>
+      </w:pPr>
+    </w:p>
+    <w:p>
+      <w:pPr>
+        <w:spacing w:after="120" w:line="264" w:lineRule="auto"/>
+      </w:pPr>
+      <w:r>
+        <w:rPr>
+          <w:rFonts w:ascii="Calibri" w:hAnsi="Calibri"/>
+          <w:b w:val="0"/>
+          <w:i w:val="0"/>
+          <w:color w:val="202124"/>
+          <w:sz w:val="21"/>
+        </w:rPr>
+        <w:t>The development comparison is the clearest measure of improvement because it uses the same expanded population and the same evidence level. ROC-AUC increased from 0.716 to 0.760 and PR-AUC increased from 0.412 to 0.462. At approximately the same 80% recall objective, precision increased from 29.8% to 33.4% and the alert rate declined from 57.6% to 51.3%. The model therefore ranked deteriorations more effectively while sending a smaller share of observations to analysts.</w:t>
+      </w:r>
+    </w:p>
+    <w:p>
+      <w:pPr>
+        <w:spacing w:after="120" w:line="264" w:lineRule="auto"/>
+      </w:pPr>
+      <w:r>
+        <w:rPr>
+          <w:rFonts w:ascii="Calibri" w:hAnsi="Calibri"/>
+          <w:b w:val="0"/>
+          <w:i w:val="0"/>
+          <w:color w:val="202124"/>
+          <w:sz w:val="21"/>
+        </w:rPr>
+        <w:t>After the model families, feature process, blend weight, and sector thresholds were frozen, the ensemble was evaluated once on decisions from July through December 2024 whose four-quarter outcomes matured during 2025. Across 178 observations from 93 companies and 28 deterioration events, it achieved 0.841 ROC-AUC, 0.494 PR-AUC, and 85.7% recall. ROC-AUC measures how consistently the model ranks deteriorating observations above non-deteriorating observations across all thresholds; PR-AUC focuses more directly on ranking the less common deterioration events.</w:t>
+      </w:r>
+    </w:p>
+    <w:p>
+      <w:pPr>
+        <w:spacing w:after="120" w:line="264" w:lineRule="auto"/>
+      </w:pPr>
+      <w:r>
+        <w:rPr>
+          <w:rFonts w:ascii="Calibri" w:hAnsi="Calibri"/>
+          <w:b w:val="0"/>
+          <w:i w:val="0"/>
+          <w:color w:val="202124"/>
+          <w:sz w:val="21"/>
+        </w:rPr>
+        <w:t>These results are stronger than the earlier development evidence because they combine higher ranking metrics with a later period that was not used to select the final specification. They do not mean every alert was correct: sealed-test precision was 26.4%, and 51.1% of observations still entered the review queue because the policy intentionally favors finding deteriorations over minimizing false alerts. Company-clustered 95% intervals of 0.742-0.924 for ROC-AUC and 0.317-0.691 for PR-AUC also show that uncertainty remains meaningful.</w:t>
+      </w:r>
+    </w:p>
+    <w:p>
+      <w:pPr>
+        <w:pStyle w:val="Heading1"/>
+        <w:keepNext/>
+      </w:pPr>
+      <w:r>
+        <w:rPr>
+          <w:rFonts w:ascii="Calibri" w:hAnsi="Calibri"/>
+          <w:b/>
+          <w:i w:val="0"/>
+          <w:color w:val="17365D"/>
+          <w:sz w:val="32"/>
+        </w:rPr>
+        <w:t>17. Limitations and governance</w:t>
       </w:r>
     </w:p>
     <w:p>
@@ -7107,7 +8040,7 @@
           <w:color w:val="17365D"/>
           <w:sz w:val="32"/>
         </w:rPr>
-        <w:t>16. Bridge backtest and prospective test plan</w:t>
+        <w:t>18. Bridge analysis and prospective test plan</w:t>
       </w:r>
     </w:p>
     <w:p>
@@ -7122,7 +8055,7 @@
           <w:color w:val="202124"/>
           <w:sz w:val="21"/>
         </w:rPr>
-        <w:t>Before the final post-2025 prospective test matures, the project will conduct a pseudo-prospective backtest. Models will be trained using financial information available through 31 December 2023, predictions will be generated from information available at decision dates during 2024, and those predictions will be evaluated against four-quarter outcomes extending through 2025. This preserves the order in which information became available and provides a recent backtest. However, because the 2024-2025 period has already been observed during the broader project, the result will be treated as retrospective development evidence rather than a new untouched holdout.</w:t>
+        <w:t>Phase 2 completed the planned recent-period evaluation by freezing the optimized model before scoring decisions from July through December 2024 against four-quarter outcomes extending through 2025. Information availability, label maturity, and temporal order were preserved. This provides sealed out-of-time evidence for the current experiment, while a later period that matures after the model freeze remains valuable as an additional prospective replication.</w:t>
       </w:r>
     </w:p>
     <w:p>
@@ -7880,7 +8813,7 @@
           <w:color w:val="17365D"/>
           <w:sz w:val="32"/>
         </w:rPr>
-        <w:t>17. Final conclusions</w:t>
+        <w:t>19. Final conclusions</w:t>
       </w:r>
     </w:p>
     <w:p>
@@ -7895,7 +8828,7 @@
           <w:color w:val="202124"/>
           <w:sz w:val="21"/>
         </w:rPr>
-        <w:t>The project achieved its Phase 1 goal: a reproducible, point-in-time financial deterioration prototype with a legitimate locked-holdout benchmark. It also achieved the implementation goals of Phase 2: broader sampling, more defensible missing-data eligibility, interpretable partial pooling, fold-local feature selection, empirical forecast-interval recalibration, recall-first sector thresholds, uncertainty estimates, monitoring, horizon sensitivity, and company cases.</w:t>
+        <w:t>The project achieved its Phase 1 goal: a reproducible, point-in-time financial deterioration prototype with a legitimate locked-holdout benchmark. It also achieved the goals of Phase 2: broader sampling, more defensible missing-data eligibility, interpretable partial pooling, fold-local feature selection, empirical forecast-interval recalibration, recall-first sector thresholds, uncertainty estimates, monitoring, horizon sensitivity, company cases, systematic model optimization, and a sealed out-of-time evaluation.</w:t>
       </w:r>
     </w:p>
     <w:p>
@@ -7910,7 +8843,7 @@
           <w:color w:val="202124"/>
           <w:sz w:val="21"/>
         </w:rPr>
-        <w:t>The project has not yet achieved a definitive Phase 2 future-performance result. The current evidence supports a controlled analyst-augmentation use case and a strong financial data-science portfolio demonstration, not autonomous credit decisions. The most defensible operating design is a four-quarter medium-term primary screen, an optional two-quarter near-term flag, transparent reason codes, and mandatory manual review.</w:t>
+        <w:t>The optimized ensemble's 0.841 ROC-AUC, 0.494 PR-AUC, and 85.7% recall provide successful later-period test evidence, but one period and two sectors cannot establish universal future performance. The model serves as an additional screening tool that flags companies for further review and helps analysts identify potential interest-coverage problems more efficiently. The most defensible operating design is a four-quarter medium-term primary screen, an optional two-quarter near-term flag, transparent reason codes, and mandatory manual review.</w:t>
       </w:r>
     </w:p>
     <w:p>
@@ -8069,7 +9002,7 @@
                 <w:color w:val="202124"/>
                 <w:sz w:val="17"/>
               </w:rPr>
-              <w:t>Project status, Phase 1 benchmark, limitations, and Phase 2 design</w:t>
+              <w:t>Project status, benchmark, limitations, Phase 2 design, and publication links</w:t>
             </w:r>
           </w:p>
         </w:tc>
@@ -8125,7 +9058,7 @@
                 <w:color w:val="202124"/>
                 <w:sz w:val="17"/>
               </w:rPr>
-              <w:t>Frozen Phase 2 population, seed, model, horizon, and threshold policy</w:t>
+              <w:t>Frozen population, seed, model, horizon, and threshold policy; tests verify key controls</w:t>
             </w:r>
           </w:p>
         </w:tc>
@@ -8266,7 +9199,7 @@
                 <w:color w:val="202124"/>
                 <w:sz w:val="17"/>
               </w:rPr>
-              <w:t>reports/generated/phase2_*.csv</w:t>
+              <w:t>reports/generated/phase2_*.csv and reports/source_data/*final_metrics.json</w:t>
             </w:r>
           </w:p>
         </w:tc>
@@ -8293,129 +9226,12 @@
                 <w:color w:val="202124"/>
                 <w:sz w:val="17"/>
               </w:rPr>
-              <w:t>Auditable metrics, thresholds, feature evidence, cases, monitoring, and sensitivity results</w:t>
-            </w:r>
-          </w:p>
-        </w:tc>
-      </w:tr>
-      <w:tr>
-        <w:tc>
-          <w:tcPr>
-            <w:tcW w:type="dxa" w:w="3600"/>
-            <w:vAlign w:val="center"/>
-            <w:tcMar>
-              <w:top w:w="80" w:type="dxa"/>
-              <w:bottom w:w="80" w:type="dxa"/>
-              <w:start w:w="120" w:type="dxa"/>
-              <w:end w:w="120" w:type="dxa"/>
-            </w:tcMar>
-          </w:tcPr>
-          <w:p>
-            <w:pPr>
-              <w:spacing w:after="0"/>
-            </w:pPr>
-            <w:r>
-              <w:rPr>
-                <w:rFonts w:ascii="Calibri" w:hAnsi="Calibri"/>
-                <w:b w:val="0"/>
-                <w:i w:val="0"/>
-                <w:color w:val="202124"/>
-                <w:sz w:val="17"/>
-              </w:rPr>
-              <w:t>reports/publication/*Phase1* and *Phase2*</w:t>
-            </w:r>
-          </w:p>
-        </w:tc>
-        <w:tc>
-          <w:tcPr>
-            <w:tcW w:type="dxa" w:w="5760"/>
-            <w:vAlign w:val="center"/>
-            <w:tcMar>
-              <w:top w:w="80" w:type="dxa"/>
-              <w:bottom w:w="80" w:type="dxa"/>
-              <w:start w:w="120" w:type="dxa"/>
-              <w:end w:w="120" w:type="dxa"/>
-            </w:tcMar>
-          </w:tcPr>
-          <w:p>
-            <w:pPr>
-              <w:spacing w:after="0"/>
-            </w:pPr>
-            <w:r>
-              <w:rPr>
-                <w:rFonts w:ascii="Calibri" w:hAnsi="Calibri"/>
-                <w:b w:val="0"/>
-                <w:i w:val="0"/>
-                <w:color w:val="202124"/>
-                <w:sz w:val="17"/>
-              </w:rPr>
-              <w:t>Phase-specific published research records</w:t>
-            </w:r>
-          </w:p>
-        </w:tc>
-      </w:tr>
-      <w:tr>
-        <w:tc>
-          <w:tcPr>
-            <w:tcW w:type="dxa" w:w="3600"/>
-            <w:vAlign w:val="center"/>
-            <w:tcMar>
-              <w:top w:w="80" w:type="dxa"/>
-              <w:bottom w:w="80" w:type="dxa"/>
-              <w:start w:w="120" w:type="dxa"/>
-              <w:end w:w="120" w:type="dxa"/>
-            </w:tcMar>
-          </w:tcPr>
-          <w:p>
-            <w:pPr>
-              <w:spacing w:after="0"/>
-            </w:pPr>
-            <w:r>
-              <w:rPr>
-                <w:rFonts w:ascii="Calibri" w:hAnsi="Calibri"/>
-                <w:b w:val="0"/>
-                <w:i w:val="0"/>
-                <w:color w:val="202124"/>
-                <w:sz w:val="17"/>
-              </w:rPr>
-              <w:t>tests/</w:t>
-            </w:r>
-          </w:p>
-        </w:tc>
-        <w:tc>
-          <w:tcPr>
-            <w:tcW w:type="dxa" w:w="5760"/>
-            <w:vAlign w:val="center"/>
-            <w:tcMar>
-              <w:top w:w="80" w:type="dxa"/>
-              <w:bottom w:w="80" w:type="dxa"/>
-              <w:start w:w="120" w:type="dxa"/>
-              <w:end w:w="120" w:type="dxa"/>
-            </w:tcMar>
-          </w:tcPr>
-          <w:p>
-            <w:pPr>
-              <w:spacing w:after="0"/>
-            </w:pPr>
-            <w:r>
-              <w:rPr>
-                <w:rFonts w:ascii="Calibri" w:hAnsi="Calibri"/>
-                <w:b w:val="0"/>
-                <w:i w:val="0"/>
-                <w:color w:val="202124"/>
-                <w:sz w:val="17"/>
-              </w:rPr>
-              <w:t>Sampling, transformation, temporal, leakage, model, and reporting checks</w:t>
+              <w:t>Auditable Phase 2 metrics, feature evidence, monitoring, sensitivity, and sealed-test support</w:t>
             </w:r>
           </w:p>
         </w:tc>
       </w:tr>
     </w:tbl>
-    <w:p>
-      <w:pPr>
-        <w:spacing w:after="0"/>
-      </w:pPr>
-    </w:p>
     <w:sectPr>
       <w:headerReference w:type="default" r:id="rId9"/>
       <w:footerReference w:type="default" r:id="rId10"/>
@@ -8433,10 +9249,22 @@
   <w:p>
     <w:pPr>
       <w:pStyle w:val="Footer"/>
-      <w:jc w:val="right"/>
+      <w:jc w:val="center"/>
     </w:pPr>
+    <w:r/>
     <w:r>
-      <w:t>Integrated financial risk analysis | Evidence levels remain separate</w:t>
+      <w:rPr>
+        <w:rFonts w:ascii="Calibri" w:hAnsi="Calibri"/>
+        <w:b w:val="0"/>
+        <w:i w:val="0"/>
+        <w:color w:val="667085"/>
+        <w:sz w:val="16"/>
+      </w:rPr>
+      <w:fldChar w:fldCharType="begin"/>
+      <w:instrText xml:space="preserve"> PAGE </w:instrText>
+      <w:fldChar w:fldCharType="separate"/>
+      <w:t>1</w:t>
+      <w:fldChar w:fldCharType="end"/>
     </w:r>
   </w:p>
 </w:ftr>

</xml_diff>